<commit_message>
Configuration Management Using File System (ClassPath:/config)
</commit_message>
<xml_diff>
--- a/Course.docx
+++ b/Course.docx
@@ -1120,15 +1120,20 @@
         <w:spacing w:line="360" w:lineRule="auto"/>
         <w:rPr>
           <w:rFonts w:cstheme="minorHAnsi"/>
-          <w:sz w:val="24"/>
-          <w:szCs w:val="24"/>
-        </w:rPr>
-      </w:pPr>
-      <w:r>
-        <w:rPr>
-          <w:rFonts w:cstheme="minorHAnsi"/>
-          <w:sz w:val="24"/>
-          <w:szCs w:val="24"/>
+          <w:b/>
+          <w:bCs/>
+          <w:sz w:val="30"/>
+          <w:szCs w:val="30"/>
+        </w:rPr>
+      </w:pPr>
+      <w:r>
+        <w:rPr>
+          <w:rFonts w:cstheme="minorHAnsi"/>
+          <w:b/>
+          <w:bCs/>
+          <w:sz w:val="30"/>
+          <w:szCs w:val="30"/>
+          <w:highlight w:val="green"/>
         </w:rPr>
         <w:lastRenderedPageBreak/>
         <w:t>Configuration Management in Microservices</w:t>
@@ -1417,6 +1422,14 @@
           <w:szCs w:val="24"/>
         </w:rPr>
         <w:br/>
+      </w:r>
+      <w:r>
+        <w:rPr>
+          <w:rFonts w:cstheme="minorHAnsi"/>
+          <w:sz w:val="24"/>
+          <w:szCs w:val="24"/>
+        </w:rPr>
+        <w:lastRenderedPageBreak/>
         <w:t xml:space="preserve">If the build version is defined in </w:t>
       </w:r>
       <w:proofErr w:type="spellStart"/>
@@ -1475,7 +1488,6 @@
           <w:sz w:val="24"/>
           <w:szCs w:val="24"/>
         </w:rPr>
-        <w:lastRenderedPageBreak/>
         <w:t>Application.yml</w:t>
       </w:r>
       <w:proofErr w:type="spellEnd"/>
@@ -1493,6 +1505,7 @@
       <w:r>
         <w:rPr>
           <w:rFonts w:cstheme="minorHAnsi"/>
+          <w:noProof/>
           <w:sz w:val="24"/>
           <w:szCs w:val="24"/>
         </w:rPr>
@@ -1565,6 +1578,7 @@
       <w:r>
         <w:rPr>
           <w:rFonts w:cstheme="minorHAnsi"/>
+          <w:noProof/>
           <w:sz w:val="24"/>
           <w:szCs w:val="24"/>
         </w:rPr>
@@ -1618,6 +1632,7 @@
       <w:r>
         <w:rPr>
           <w:rFonts w:cstheme="minorHAnsi"/>
+          <w:noProof/>
           <w:sz w:val="24"/>
           <w:szCs w:val="24"/>
         </w:rPr>
@@ -1802,6 +1817,7 @@
       <w:r>
         <w:rPr>
           <w:rFonts w:cstheme="minorHAnsi"/>
+          <w:noProof/>
           <w:sz w:val="24"/>
           <w:szCs w:val="24"/>
         </w:rPr>
@@ -1921,11 +1937,13 @@
           <w:sz w:val="24"/>
           <w:szCs w:val="24"/>
         </w:rPr>
+        <w:lastRenderedPageBreak/>
         <w:t xml:space="preserve">   </w:t>
       </w:r>
       <w:r>
         <w:rPr>
           <w:rFonts w:cstheme="minorHAnsi"/>
+          <w:noProof/>
           <w:sz w:val="24"/>
           <w:szCs w:val="24"/>
         </w:rPr>
@@ -1982,7 +2000,6 @@
           <w:sz w:val="24"/>
           <w:szCs w:val="24"/>
         </w:rPr>
-        <w:lastRenderedPageBreak/>
         <w:t xml:space="preserve">In this example, the </w:t>
       </w:r>
       <w:proofErr w:type="spellStart"/>
@@ -2163,6 +2180,7 @@
       <w:r>
         <w:rPr>
           <w:rFonts w:cstheme="minorHAnsi"/>
+          <w:noProof/>
           <w:sz w:val="24"/>
           <w:szCs w:val="24"/>
         </w:rPr>
@@ -2269,9 +2287,11 @@
       <w:r>
         <w:rPr>
           <w:rFonts w:cstheme="minorHAnsi"/>
-          <w:sz w:val="24"/>
-          <w:szCs w:val="24"/>
-        </w:rPr>
+          <w:noProof/>
+          <w:sz w:val="24"/>
+          <w:szCs w:val="24"/>
+        </w:rPr>
+        <w:lastRenderedPageBreak/>
         <w:drawing>
           <wp:inline distT="0" distB="0" distL="0" distR="0" wp14:anchorId="6A2C61EE" wp14:editId="0F92A166">
             <wp:extent cx="5731510" cy="1061720"/>
@@ -2326,7 +2346,6 @@
           <w:rStyle w:val="Strong"/>
           <w:rFonts w:asciiTheme="minorHAnsi" w:hAnsiTheme="minorHAnsi" w:cstheme="minorHAnsi"/>
         </w:rPr>
-        <w:lastRenderedPageBreak/>
         <w:t>Enable Configuration Properties in the Application</w:t>
       </w:r>
       <w:r>
@@ -2394,6 +2413,7 @@
       <w:r>
         <w:rPr>
           <w:rFonts w:asciiTheme="minorHAnsi" w:hAnsiTheme="minorHAnsi" w:cstheme="minorHAnsi"/>
+          <w:noProof/>
         </w:rPr>
         <w:drawing>
           <wp:inline distT="0" distB="0" distL="0" distR="0" wp14:anchorId="08229992" wp14:editId="111A52F6">
@@ -2547,6 +2567,7 @@
           <w:sz w:val="24"/>
           <w:szCs w:val="24"/>
         </w:rPr>
+        <w:lastRenderedPageBreak/>
         <w:t xml:space="preserve">To demonstrate how profiles work, we'll create two additional configuration files: </w:t>
       </w:r>
       <w:proofErr w:type="spellStart"/>
@@ -2641,7 +2662,6 @@
           <w:sz w:val="24"/>
           <w:szCs w:val="24"/>
         </w:rPr>
-        <w:lastRenderedPageBreak/>
         <w:t xml:space="preserve">Common properties like the port number and database configuration will remain in the main </w:t>
       </w:r>
       <w:proofErr w:type="spellStart"/>
@@ -2753,6 +2773,7 @@
       <w:r>
         <w:rPr>
           <w:rFonts w:cstheme="minorHAnsi"/>
+          <w:noProof/>
           <w:sz w:val="24"/>
           <w:szCs w:val="24"/>
         </w:rPr>
@@ -2825,6 +2846,7 @@
       <w:r>
         <w:rPr>
           <w:rFonts w:cstheme="minorHAnsi"/>
+          <w:noProof/>
           <w:sz w:val="24"/>
           <w:szCs w:val="24"/>
         </w:rPr>
@@ -2896,9 +2918,11 @@
       <w:r>
         <w:rPr>
           <w:rFonts w:cstheme="minorHAnsi"/>
-          <w:sz w:val="24"/>
-          <w:szCs w:val="24"/>
-        </w:rPr>
+          <w:noProof/>
+          <w:sz w:val="24"/>
+          <w:szCs w:val="24"/>
+        </w:rPr>
+        <w:lastRenderedPageBreak/>
         <w:drawing>
           <wp:inline distT="0" distB="0" distL="0" distR="0" wp14:anchorId="1197B276" wp14:editId="31786765">
             <wp:extent cx="1955945" cy="1012489"/>
@@ -2963,6 +2987,7 @@
       <w:r>
         <w:rPr>
           <w:rFonts w:cstheme="minorHAnsi"/>
+          <w:noProof/>
           <w:sz w:val="24"/>
           <w:szCs w:val="24"/>
         </w:rPr>
@@ -3096,7 +3121,6 @@
           <w:sz w:val="24"/>
           <w:szCs w:val="24"/>
         </w:rPr>
-        <w:lastRenderedPageBreak/>
         <w:t xml:space="preserve">By default, Spring Boot loads the properties from </w:t>
       </w:r>
       <w:proofErr w:type="spellStart"/>
@@ -3138,6 +3162,7 @@
       <w:r>
         <w:rPr>
           <w:rFonts w:cstheme="minorHAnsi"/>
+          <w:noProof/>
           <w:sz w:val="24"/>
           <w:szCs w:val="24"/>
         </w:rPr>
@@ -3292,6 +3317,1609 @@
         </w:rPr>
       </w:pPr>
     </w:p>
+    <w:p>
+      <w:pPr>
+        <w:spacing w:line="360" w:lineRule="auto"/>
+        <w:rPr>
+          <w:rFonts w:cstheme="minorHAnsi"/>
+          <w:sz w:val="24"/>
+          <w:szCs w:val="24"/>
+        </w:rPr>
+      </w:pPr>
+    </w:p>
+    <w:p>
+      <w:pPr>
+        <w:spacing w:line="360" w:lineRule="auto"/>
+        <w:rPr>
+          <w:rFonts w:cstheme="minorHAnsi"/>
+          <w:sz w:val="24"/>
+          <w:szCs w:val="24"/>
+        </w:rPr>
+      </w:pPr>
+    </w:p>
+    <w:p>
+      <w:pPr>
+        <w:spacing w:line="360" w:lineRule="auto"/>
+        <w:rPr>
+          <w:rFonts w:cstheme="minorHAnsi"/>
+          <w:sz w:val="24"/>
+          <w:szCs w:val="24"/>
+        </w:rPr>
+      </w:pPr>
+    </w:p>
+    <w:p>
+      <w:pPr>
+        <w:spacing w:line="360" w:lineRule="auto"/>
+        <w:rPr>
+          <w:rFonts w:cstheme="minorHAnsi"/>
+          <w:sz w:val="24"/>
+          <w:szCs w:val="24"/>
+        </w:rPr>
+      </w:pPr>
+    </w:p>
+    <w:p>
+      <w:pPr>
+        <w:spacing w:line="360" w:lineRule="auto"/>
+        <w:rPr>
+          <w:rFonts w:cstheme="minorHAnsi"/>
+          <w:b/>
+          <w:bCs/>
+          <w:sz w:val="24"/>
+          <w:szCs w:val="24"/>
+        </w:rPr>
+      </w:pPr>
+      <w:bookmarkStart w:id="0" w:name="_Hlk181766027"/>
+      <w:r>
+        <w:rPr>
+          <w:rFonts w:cstheme="minorHAnsi"/>
+          <w:b/>
+          <w:bCs/>
+          <w:sz w:val="24"/>
+          <w:szCs w:val="24"/>
+        </w:rPr>
+        <w:lastRenderedPageBreak/>
+        <w:t>Managing Configuration in Microservices with Spring Cloud</w:t>
+      </w:r>
+    </w:p>
+    <w:p>
+      <w:pPr>
+        <w:spacing w:line="360" w:lineRule="auto"/>
+        <w:rPr>
+          <w:rFonts w:cstheme="minorHAnsi"/>
+          <w:b/>
+          <w:bCs/>
+          <w:sz w:val="24"/>
+          <w:szCs w:val="24"/>
+        </w:rPr>
+      </w:pPr>
+      <w:r>
+        <w:rPr>
+          <w:rFonts w:cstheme="minorHAnsi"/>
+          <w:b/>
+          <w:bCs/>
+          <w:sz w:val="24"/>
+          <w:szCs w:val="24"/>
+        </w:rPr>
+        <w:t xml:space="preserve">1) Reading Configuration </w:t>
+      </w:r>
+      <w:proofErr w:type="gramStart"/>
+      <w:r>
+        <w:rPr>
+          <w:rFonts w:cstheme="minorHAnsi"/>
+          <w:b/>
+          <w:bCs/>
+          <w:sz w:val="24"/>
+          <w:szCs w:val="24"/>
+        </w:rPr>
+        <w:t>From</w:t>
+      </w:r>
+      <w:proofErr w:type="gramEnd"/>
+      <w:r>
+        <w:rPr>
+          <w:rFonts w:cstheme="minorHAnsi"/>
+          <w:b/>
+          <w:bCs/>
+          <w:sz w:val="24"/>
+          <w:szCs w:val="24"/>
+        </w:rPr>
+        <w:t xml:space="preserve"> </w:t>
+      </w:r>
+      <w:proofErr w:type="spellStart"/>
+      <w:r>
+        <w:rPr>
+          <w:rFonts w:cstheme="minorHAnsi"/>
+          <w:b/>
+          <w:bCs/>
+          <w:sz w:val="24"/>
+          <w:szCs w:val="24"/>
+        </w:rPr>
+        <w:t>Classpath</w:t>
+      </w:r>
+      <w:proofErr w:type="spellEnd"/>
+    </w:p>
+    <w:p>
+      <w:pPr>
+        <w:spacing w:line="360" w:lineRule="auto"/>
+        <w:ind w:left="284"/>
+        <w:rPr>
+          <w:rFonts w:cstheme="minorHAnsi"/>
+          <w:sz w:val="24"/>
+          <w:szCs w:val="24"/>
+        </w:rPr>
+      </w:pPr>
+      <w:r>
+        <w:rPr>
+          <w:rFonts w:cstheme="minorHAnsi"/>
+          <w:b/>
+          <w:bCs/>
+          <w:sz w:val="24"/>
+          <w:szCs w:val="24"/>
+        </w:rPr>
+        <w:t>Step 1: Create a Spring Boot Project for Config Server</w:t>
+      </w:r>
+    </w:p>
+    <w:p>
+      <w:pPr>
+        <w:numPr>
+          <w:ilvl w:val="0"/>
+          <w:numId w:val="17"/>
+        </w:numPr>
+        <w:tabs>
+          <w:tab w:val="clear" w:pos="720"/>
+          <w:tab w:val="num" w:pos="710"/>
+        </w:tabs>
+        <w:spacing w:line="360" w:lineRule="auto"/>
+        <w:ind w:left="568" w:hanging="284"/>
+        <w:rPr>
+          <w:rFonts w:cstheme="minorHAnsi"/>
+          <w:sz w:val="24"/>
+          <w:szCs w:val="24"/>
+        </w:rPr>
+      </w:pPr>
+      <w:r>
+        <w:rPr>
+          <w:rFonts w:cstheme="minorHAnsi"/>
+          <w:sz w:val="24"/>
+          <w:szCs w:val="24"/>
+        </w:rPr>
+        <w:t>Start by creating a new Spring Boot project and name it “</w:t>
+      </w:r>
+      <w:proofErr w:type="spellStart"/>
+      <w:r>
+        <w:rPr>
+          <w:rFonts w:cstheme="minorHAnsi"/>
+          <w:sz w:val="24"/>
+          <w:szCs w:val="24"/>
+        </w:rPr>
+        <w:t>ConfigServer</w:t>
+      </w:r>
+      <w:proofErr w:type="spellEnd"/>
+      <w:r>
+        <w:rPr>
+          <w:rFonts w:cstheme="minorHAnsi"/>
+          <w:sz w:val="24"/>
+          <w:szCs w:val="24"/>
+        </w:rPr>
+        <w:t>.” This project will serve as a dedicated configuration server to manage the configurations of all microservices.</w:t>
+      </w:r>
+    </w:p>
+    <w:p>
+      <w:pPr>
+        <w:spacing w:line="360" w:lineRule="auto"/>
+        <w:ind w:left="284"/>
+      </w:pPr>
+      <w:r>
+        <w:rPr>
+          <w:b/>
+          <w:bCs/>
+        </w:rPr>
+        <w:t>Step 2: Add Dependencies</w:t>
+      </w:r>
+    </w:p>
+    <w:p>
+      <w:pPr>
+        <w:numPr>
+          <w:ilvl w:val="0"/>
+          <w:numId w:val="18"/>
+        </w:numPr>
+        <w:tabs>
+          <w:tab w:val="clear" w:pos="720"/>
+          <w:tab w:val="num" w:pos="568"/>
+        </w:tabs>
+        <w:spacing w:line="360" w:lineRule="auto"/>
+        <w:ind w:left="568" w:hanging="284"/>
+      </w:pPr>
+      <w:r>
+        <w:t>In the pom.xml file, include dependencies for Spring Cloud and Spring Boot Actuator.</w:t>
+      </w:r>
+    </w:p>
+    <w:p>
+      <w:pPr>
+        <w:spacing w:line="360" w:lineRule="auto"/>
+        <w:ind w:left="284"/>
+        <w:rPr>
+          <w:rFonts w:cstheme="minorHAnsi"/>
+          <w:sz w:val="24"/>
+          <w:szCs w:val="24"/>
+        </w:rPr>
+      </w:pPr>
+      <w:r>
+        <w:rPr>
+          <w:rFonts w:cstheme="minorHAnsi"/>
+          <w:b/>
+          <w:bCs/>
+          <w:sz w:val="24"/>
+          <w:szCs w:val="24"/>
+        </w:rPr>
+        <w:t>Step 3: Enable Config Server</w:t>
+      </w:r>
+    </w:p>
+    <w:p>
+      <w:pPr>
+        <w:numPr>
+          <w:ilvl w:val="0"/>
+          <w:numId w:val="19"/>
+        </w:numPr>
+        <w:tabs>
+          <w:tab w:val="clear" w:pos="720"/>
+          <w:tab w:val="num" w:pos="568"/>
+        </w:tabs>
+        <w:spacing w:line="360" w:lineRule="auto"/>
+        <w:ind w:left="568" w:hanging="284"/>
+        <w:rPr>
+          <w:rFonts w:cstheme="minorHAnsi"/>
+          <w:sz w:val="24"/>
+          <w:szCs w:val="24"/>
+        </w:rPr>
+      </w:pPr>
+      <w:r>
+        <w:rPr>
+          <w:rFonts w:cstheme="minorHAnsi"/>
+          <w:sz w:val="24"/>
+          <w:szCs w:val="24"/>
+        </w:rPr>
+        <w:t xml:space="preserve">In the </w:t>
+      </w:r>
+      <w:proofErr w:type="spellStart"/>
+      <w:r>
+        <w:rPr>
+          <w:rFonts w:cstheme="minorHAnsi"/>
+          <w:sz w:val="24"/>
+          <w:szCs w:val="24"/>
+        </w:rPr>
+        <w:t>ConfigServer</w:t>
+      </w:r>
+      <w:proofErr w:type="spellEnd"/>
+      <w:r>
+        <w:rPr>
+          <w:rFonts w:cstheme="minorHAnsi"/>
+          <w:sz w:val="24"/>
+          <w:szCs w:val="24"/>
+        </w:rPr>
+        <w:t xml:space="preserve"> application, add the @EnableConfigServer annotation. This annotation designates the application as a configuration server responsible for managing the configurations of other microservices.</w:t>
+      </w:r>
+    </w:p>
+    <w:p>
+      <w:pPr>
+        <w:spacing w:line="360" w:lineRule="auto"/>
+        <w:ind w:left="284"/>
+        <w:rPr>
+          <w:rFonts w:cstheme="minorHAnsi"/>
+          <w:sz w:val="24"/>
+          <w:szCs w:val="24"/>
+        </w:rPr>
+      </w:pPr>
+      <w:r>
+        <w:rPr>
+          <w:rFonts w:cstheme="minorHAnsi"/>
+          <w:sz w:val="24"/>
+          <w:szCs w:val="24"/>
+        </w:rPr>
+        <w:drawing>
+          <wp:inline distT="0" distB="0" distL="0" distR="0" wp14:anchorId="42BF84A9" wp14:editId="7704D4C0">
+            <wp:extent cx="5731510" cy="1180465"/>
+            <wp:effectExtent l="0" t="0" r="2540" b="635"/>
+            <wp:docPr id="1444174514" name="Picture 1"/>
+            <wp:cNvGraphicFramePr>
+              <a:graphicFrameLocks xmlns:a="http://schemas.openxmlformats.org/drawingml/2006/main" noChangeAspect="1"/>
+            </wp:cNvGraphicFramePr>
+            <a:graphic xmlns:a="http://schemas.openxmlformats.org/drawingml/2006/main">
+              <a:graphicData uri="http://schemas.openxmlformats.org/drawingml/2006/picture">
+                <pic:pic xmlns:pic="http://schemas.openxmlformats.org/drawingml/2006/picture">
+                  <pic:nvPicPr>
+                    <pic:cNvPr id="1444174514" name=""/>
+                    <pic:cNvPicPr/>
+                  </pic:nvPicPr>
+                  <pic:blipFill>
+                    <a:blip r:embed="rId20"/>
+                    <a:stretch>
+                      <a:fillRect/>
+                    </a:stretch>
+                  </pic:blipFill>
+                  <pic:spPr>
+                    <a:xfrm>
+                      <a:off x="0" y="0"/>
+                      <a:ext cx="5731510" cy="1180465"/>
+                    </a:xfrm>
+                    <a:prstGeom prst="rect">
+                      <a:avLst/>
+                    </a:prstGeom>
+                  </pic:spPr>
+                </pic:pic>
+              </a:graphicData>
+            </a:graphic>
+          </wp:inline>
+        </w:drawing>
+      </w:r>
+    </w:p>
+    <w:p>
+      <w:pPr>
+        <w:spacing w:line="360" w:lineRule="auto"/>
+        <w:ind w:left="284"/>
+        <w:rPr>
+          <w:rFonts w:cstheme="minorHAnsi"/>
+          <w:sz w:val="24"/>
+          <w:szCs w:val="24"/>
+        </w:rPr>
+      </w:pPr>
+      <w:r>
+        <w:rPr>
+          <w:rFonts w:cstheme="minorHAnsi"/>
+          <w:b/>
+          <w:bCs/>
+          <w:sz w:val="24"/>
+          <w:szCs w:val="24"/>
+        </w:rPr>
+        <w:t xml:space="preserve">Step 4: Configure </w:t>
+      </w:r>
+      <w:proofErr w:type="spellStart"/>
+      <w:r>
+        <w:rPr>
+          <w:rFonts w:cstheme="minorHAnsi"/>
+          <w:b/>
+          <w:bCs/>
+          <w:sz w:val="24"/>
+          <w:szCs w:val="24"/>
+        </w:rPr>
+        <w:t>application.yml</w:t>
+      </w:r>
+      <w:proofErr w:type="spellEnd"/>
+    </w:p>
+    <w:p>
+      <w:pPr>
+        <w:numPr>
+          <w:ilvl w:val="0"/>
+          <w:numId w:val="20"/>
+        </w:numPr>
+        <w:tabs>
+          <w:tab w:val="clear" w:pos="720"/>
+          <w:tab w:val="num" w:pos="568"/>
+        </w:tabs>
+        <w:spacing w:line="360" w:lineRule="auto"/>
+        <w:ind w:left="568" w:hanging="284"/>
+        <w:rPr>
+          <w:rFonts w:cstheme="minorHAnsi"/>
+          <w:sz w:val="24"/>
+          <w:szCs w:val="24"/>
+        </w:rPr>
+      </w:pPr>
+      <w:r>
+        <w:rPr>
+          <w:rFonts w:cstheme="minorHAnsi"/>
+          <w:sz w:val="24"/>
+          <w:szCs w:val="24"/>
+        </w:rPr>
+        <w:t xml:space="preserve">Set the </w:t>
+      </w:r>
+      <w:proofErr w:type="spellStart"/>
+      <w:r>
+        <w:rPr>
+          <w:rFonts w:cstheme="minorHAnsi"/>
+          <w:sz w:val="24"/>
+          <w:szCs w:val="24"/>
+        </w:rPr>
+        <w:t>application.yml</w:t>
+      </w:r>
+      <w:proofErr w:type="spellEnd"/>
+      <w:r>
+        <w:rPr>
+          <w:rFonts w:cstheme="minorHAnsi"/>
+          <w:sz w:val="24"/>
+          <w:szCs w:val="24"/>
+        </w:rPr>
+        <w:t xml:space="preserve"> file with a port number (e.g., 8071) and an application name (</w:t>
+      </w:r>
+      <w:proofErr w:type="spellStart"/>
+      <w:r>
+        <w:rPr>
+          <w:rFonts w:cstheme="minorHAnsi"/>
+          <w:sz w:val="24"/>
+          <w:szCs w:val="24"/>
+        </w:rPr>
+        <w:t>configserver</w:t>
+      </w:r>
+      <w:proofErr w:type="spellEnd"/>
+      <w:r>
+        <w:rPr>
+          <w:rFonts w:cstheme="minorHAnsi"/>
+          <w:sz w:val="24"/>
+          <w:szCs w:val="24"/>
+        </w:rPr>
+        <w:t>). This name will help other microservices identify which server to connect to for configuration.</w:t>
+      </w:r>
+    </w:p>
+    <w:p>
+      <w:pPr>
+        <w:numPr>
+          <w:ilvl w:val="0"/>
+          <w:numId w:val="20"/>
+        </w:numPr>
+        <w:tabs>
+          <w:tab w:val="clear" w:pos="720"/>
+          <w:tab w:val="num" w:pos="568"/>
+        </w:tabs>
+        <w:spacing w:line="360" w:lineRule="auto"/>
+        <w:ind w:left="568" w:hanging="284"/>
+        <w:rPr>
+          <w:rFonts w:cstheme="minorHAnsi"/>
+          <w:sz w:val="24"/>
+          <w:szCs w:val="24"/>
+        </w:rPr>
+      </w:pPr>
+      <w:r>
+        <w:rPr>
+          <w:rFonts w:cstheme="minorHAnsi"/>
+          <w:sz w:val="24"/>
+          <w:szCs w:val="24"/>
+        </w:rPr>
+        <w:t>Add profile configurations by setting the active profile to native. This informs Spring Boot to use the native profile for local property management.</w:t>
+      </w:r>
+    </w:p>
+    <w:p>
+      <w:pPr>
+        <w:numPr>
+          <w:ilvl w:val="0"/>
+          <w:numId w:val="20"/>
+        </w:numPr>
+        <w:tabs>
+          <w:tab w:val="clear" w:pos="720"/>
+          <w:tab w:val="num" w:pos="568"/>
+        </w:tabs>
+        <w:spacing w:line="360" w:lineRule="auto"/>
+        <w:ind w:left="568" w:hanging="284"/>
+        <w:rPr>
+          <w:rFonts w:cstheme="minorHAnsi"/>
+          <w:sz w:val="24"/>
+          <w:szCs w:val="24"/>
+        </w:rPr>
+      </w:pPr>
+      <w:r>
+        <w:rPr>
+          <w:rFonts w:cstheme="minorHAnsi"/>
+          <w:sz w:val="24"/>
+          <w:szCs w:val="24"/>
+        </w:rPr>
+        <w:t xml:space="preserve">Create a config folder and add environment-specific </w:t>
+      </w:r>
+      <w:proofErr w:type="spellStart"/>
+      <w:r>
+        <w:rPr>
+          <w:rFonts w:cstheme="minorHAnsi"/>
+          <w:sz w:val="24"/>
+          <w:szCs w:val="24"/>
+        </w:rPr>
+        <w:t>application.yml</w:t>
+      </w:r>
+      <w:proofErr w:type="spellEnd"/>
+      <w:r>
+        <w:rPr>
+          <w:rFonts w:cstheme="minorHAnsi"/>
+          <w:sz w:val="24"/>
+          <w:szCs w:val="24"/>
+        </w:rPr>
+        <w:t xml:space="preserve"> files for each microservice. Name each file according to the microservice and environment. For instance, if the microservice is named accounts, the configuration file for the production environment should be named accounts-</w:t>
+      </w:r>
+      <w:proofErr w:type="spellStart"/>
+      <w:r>
+        <w:rPr>
+          <w:rFonts w:cstheme="minorHAnsi"/>
+          <w:sz w:val="24"/>
+          <w:szCs w:val="24"/>
+        </w:rPr>
+        <w:t>prod.yml</w:t>
+      </w:r>
+      <w:proofErr w:type="spellEnd"/>
+      <w:r>
+        <w:rPr>
+          <w:rFonts w:cstheme="minorHAnsi"/>
+          <w:sz w:val="24"/>
+          <w:szCs w:val="24"/>
+        </w:rPr>
+        <w:t>, while the file for the QA environment should be accounts-</w:t>
+      </w:r>
+      <w:proofErr w:type="spellStart"/>
+      <w:r>
+        <w:rPr>
+          <w:rFonts w:cstheme="minorHAnsi"/>
+          <w:sz w:val="24"/>
+          <w:szCs w:val="24"/>
+        </w:rPr>
+        <w:t>qa.yml</w:t>
+      </w:r>
+      <w:proofErr w:type="spellEnd"/>
+      <w:r>
+        <w:rPr>
+          <w:rFonts w:cstheme="minorHAnsi"/>
+          <w:sz w:val="24"/>
+          <w:szCs w:val="24"/>
+        </w:rPr>
+        <w:t>.</w:t>
+      </w:r>
+    </w:p>
+    <w:p>
+      <w:pPr>
+        <w:numPr>
+          <w:ilvl w:val="0"/>
+          <w:numId w:val="20"/>
+        </w:numPr>
+        <w:tabs>
+          <w:tab w:val="clear" w:pos="720"/>
+          <w:tab w:val="num" w:pos="568"/>
+        </w:tabs>
+        <w:spacing w:line="360" w:lineRule="auto"/>
+        <w:ind w:left="568" w:hanging="284"/>
+        <w:rPr>
+          <w:rFonts w:cstheme="minorHAnsi"/>
+          <w:sz w:val="24"/>
+          <w:szCs w:val="24"/>
+        </w:rPr>
+      </w:pPr>
+      <w:r>
+        <w:rPr>
+          <w:rFonts w:cstheme="minorHAnsi"/>
+          <w:sz w:val="24"/>
+          <w:szCs w:val="24"/>
+        </w:rPr>
+        <w:lastRenderedPageBreak/>
+        <w:t xml:space="preserve">Specify the file path where the properties are stored. For example, if the YAML configuration files for different environments (production/QA) are stored under </w:t>
+      </w:r>
+      <w:proofErr w:type="spellStart"/>
+      <w:r>
+        <w:rPr>
+          <w:rFonts w:cstheme="minorHAnsi"/>
+          <w:sz w:val="24"/>
+          <w:szCs w:val="24"/>
+        </w:rPr>
+        <w:t>classpath</w:t>
+      </w:r>
+      <w:proofErr w:type="spellEnd"/>
+      <w:r>
+        <w:rPr>
+          <w:rFonts w:cstheme="minorHAnsi"/>
+          <w:sz w:val="24"/>
+          <w:szCs w:val="24"/>
+        </w:rPr>
+        <w:t>, add this location in the search-locations variable. This setup enables the configuration server to locate and serve the necessary properties to each microservice.</w:t>
+      </w:r>
+    </w:p>
+    <w:p>
+      <w:pPr>
+        <w:spacing w:line="360" w:lineRule="auto"/>
+        <w:ind w:left="284"/>
+        <w:rPr>
+          <w:rFonts w:cstheme="minorHAnsi"/>
+          <w:sz w:val="24"/>
+          <w:szCs w:val="24"/>
+        </w:rPr>
+      </w:pPr>
+      <w:r>
+        <w:rPr>
+          <w:rFonts w:cstheme="minorHAnsi"/>
+          <w:sz w:val="24"/>
+          <w:szCs w:val="24"/>
+        </w:rPr>
+        <w:drawing>
+          <wp:inline distT="0" distB="0" distL="0" distR="0" wp14:anchorId="032EBFD3" wp14:editId="4D22D149">
+            <wp:extent cx="4339477" cy="2647950"/>
+            <wp:effectExtent l="0" t="0" r="4445" b="0"/>
+            <wp:docPr id="972661058" name="Picture 1"/>
+            <wp:cNvGraphicFramePr>
+              <a:graphicFrameLocks xmlns:a="http://schemas.openxmlformats.org/drawingml/2006/main" noChangeAspect="1"/>
+            </wp:cNvGraphicFramePr>
+            <a:graphic xmlns:a="http://schemas.openxmlformats.org/drawingml/2006/main">
+              <a:graphicData uri="http://schemas.openxmlformats.org/drawingml/2006/picture">
+                <pic:pic xmlns:pic="http://schemas.openxmlformats.org/drawingml/2006/picture">
+                  <pic:nvPicPr>
+                    <pic:cNvPr id="972661058" name=""/>
+                    <pic:cNvPicPr/>
+                  </pic:nvPicPr>
+                  <pic:blipFill>
+                    <a:blip r:embed="rId21"/>
+                    <a:stretch>
+                      <a:fillRect/>
+                    </a:stretch>
+                  </pic:blipFill>
+                  <pic:spPr>
+                    <a:xfrm>
+                      <a:off x="0" y="0"/>
+                      <a:ext cx="4361651" cy="2661480"/>
+                    </a:xfrm>
+                    <a:prstGeom prst="rect">
+                      <a:avLst/>
+                    </a:prstGeom>
+                  </pic:spPr>
+                </pic:pic>
+              </a:graphicData>
+            </a:graphic>
+          </wp:inline>
+        </w:drawing>
+      </w:r>
+    </w:p>
+    <w:p>
+      <w:pPr>
+        <w:spacing w:line="360" w:lineRule="auto"/>
+        <w:ind w:left="284"/>
+        <w:rPr>
+          <w:rFonts w:cstheme="minorHAnsi"/>
+          <w:sz w:val="24"/>
+          <w:szCs w:val="24"/>
+        </w:rPr>
+      </w:pPr>
+      <w:r>
+        <w:rPr>
+          <w:rFonts w:cstheme="minorHAnsi"/>
+          <w:b/>
+          <w:bCs/>
+          <w:sz w:val="24"/>
+          <w:szCs w:val="24"/>
+        </w:rPr>
+        <w:t>Step 5: Remove Unnecessary Configuration from Microservices</w:t>
+      </w:r>
+    </w:p>
+    <w:p>
+      <w:pPr>
+        <w:numPr>
+          <w:ilvl w:val="0"/>
+          <w:numId w:val="21"/>
+        </w:numPr>
+        <w:tabs>
+          <w:tab w:val="clear" w:pos="720"/>
+          <w:tab w:val="num" w:pos="568"/>
+        </w:tabs>
+        <w:spacing w:line="360" w:lineRule="auto"/>
+        <w:ind w:left="568" w:hanging="284"/>
+        <w:rPr>
+          <w:rFonts w:cstheme="minorHAnsi"/>
+          <w:sz w:val="24"/>
+          <w:szCs w:val="24"/>
+        </w:rPr>
+      </w:pPr>
+      <w:r>
+        <w:rPr>
+          <w:rFonts w:cstheme="minorHAnsi"/>
+          <w:sz w:val="24"/>
+          <w:szCs w:val="24"/>
+        </w:rPr>
+        <w:t xml:space="preserve">In this step, remove any redundant configuration settings from all microservices, such as </w:t>
+      </w:r>
+      <w:proofErr w:type="spellStart"/>
+      <w:r>
+        <w:rPr>
+          <w:rFonts w:cstheme="minorHAnsi"/>
+          <w:sz w:val="24"/>
+          <w:szCs w:val="24"/>
+        </w:rPr>
+        <w:t>spring.</w:t>
+      </w:r>
+      <w:proofErr w:type="gramStart"/>
+      <w:r>
+        <w:rPr>
+          <w:rFonts w:cstheme="minorHAnsi"/>
+          <w:sz w:val="24"/>
+          <w:szCs w:val="24"/>
+        </w:rPr>
+        <w:t>config.activate</w:t>
+      </w:r>
+      <w:proofErr w:type="gramEnd"/>
+      <w:r>
+        <w:rPr>
+          <w:rFonts w:cstheme="minorHAnsi"/>
+          <w:sz w:val="24"/>
+          <w:szCs w:val="24"/>
+        </w:rPr>
+        <w:t>.on</w:t>
+      </w:r>
+      <w:proofErr w:type="spellEnd"/>
+      <w:r>
+        <w:rPr>
+          <w:rFonts w:cstheme="minorHAnsi"/>
+          <w:sz w:val="24"/>
+          <w:szCs w:val="24"/>
+        </w:rPr>
+        <w:t>-profile: “</w:t>
+      </w:r>
+      <w:proofErr w:type="spellStart"/>
+      <w:r>
+        <w:rPr>
+          <w:rFonts w:cstheme="minorHAnsi"/>
+          <w:sz w:val="24"/>
+          <w:szCs w:val="24"/>
+        </w:rPr>
+        <w:t>qa</w:t>
+      </w:r>
+      <w:proofErr w:type="spellEnd"/>
+      <w:r>
+        <w:rPr>
+          <w:rFonts w:cstheme="minorHAnsi"/>
+          <w:sz w:val="24"/>
+          <w:szCs w:val="24"/>
+        </w:rPr>
+        <w:t>”. Since we are now using Spring Cloud Config to centralize and manage configurations, these individual settings within each microservice are no longer needed.</w:t>
+      </w:r>
+    </w:p>
+    <w:p>
+      <w:pPr>
+        <w:numPr>
+          <w:ilvl w:val="0"/>
+          <w:numId w:val="21"/>
+        </w:numPr>
+        <w:tabs>
+          <w:tab w:val="clear" w:pos="720"/>
+          <w:tab w:val="num" w:pos="568"/>
+        </w:tabs>
+        <w:spacing w:line="360" w:lineRule="auto"/>
+        <w:ind w:left="568" w:hanging="284"/>
+        <w:rPr>
+          <w:rFonts w:cstheme="minorHAnsi"/>
+          <w:sz w:val="24"/>
+          <w:szCs w:val="24"/>
+        </w:rPr>
+      </w:pPr>
+      <w:r>
+        <w:rPr>
+          <w:rFonts w:cstheme="minorHAnsi"/>
+          <w:sz w:val="24"/>
+          <w:szCs w:val="24"/>
+        </w:rPr>
+        <w:t>By removing these configurations, we ensure that each microservice relies solely on the configuration provided by the central Config Server, streamlining the configuration process across all services.</w:t>
+      </w:r>
+    </w:p>
+    <w:p>
+      <w:pPr>
+        <w:numPr>
+          <w:ilvl w:val="0"/>
+          <w:numId w:val="21"/>
+        </w:numPr>
+        <w:tabs>
+          <w:tab w:val="clear" w:pos="720"/>
+          <w:tab w:val="num" w:pos="568"/>
+        </w:tabs>
+        <w:spacing w:line="360" w:lineRule="auto"/>
+        <w:ind w:left="568" w:hanging="284"/>
+        <w:rPr>
+          <w:rFonts w:cstheme="minorHAnsi"/>
+          <w:sz w:val="24"/>
+          <w:szCs w:val="24"/>
+        </w:rPr>
+      </w:pPr>
+      <w:r>
+        <w:rPr>
+          <w:rFonts w:cstheme="minorHAnsi"/>
+          <w:sz w:val="24"/>
+          <w:szCs w:val="24"/>
+        </w:rPr>
+        <w:t>Keep environment-specific properties like build version and contact information, as these will vary based on the environment and should remain unique to each service.</w:t>
+      </w:r>
+    </w:p>
+    <w:p>
+      <w:pPr>
+        <w:spacing w:line="360" w:lineRule="auto"/>
+        <w:ind w:left="284"/>
+        <w:rPr>
+          <w:rFonts w:cstheme="minorHAnsi"/>
+          <w:sz w:val="24"/>
+          <w:szCs w:val="24"/>
+        </w:rPr>
+      </w:pPr>
+      <w:r>
+        <w:rPr>
+          <w:rFonts w:cstheme="minorHAnsi"/>
+          <w:sz w:val="24"/>
+          <w:szCs w:val="24"/>
+        </w:rPr>
+        <w:lastRenderedPageBreak/>
+        <w:drawing>
+          <wp:inline distT="0" distB="0" distL="0" distR="0" wp14:anchorId="410BCA55" wp14:editId="091C043A">
+            <wp:extent cx="4114800" cy="2648223"/>
+            <wp:effectExtent l="0" t="0" r="0" b="0"/>
+            <wp:docPr id="357547353" name="Picture 1"/>
+            <wp:cNvGraphicFramePr>
+              <a:graphicFrameLocks xmlns:a="http://schemas.openxmlformats.org/drawingml/2006/main" noChangeAspect="1"/>
+            </wp:cNvGraphicFramePr>
+            <a:graphic xmlns:a="http://schemas.openxmlformats.org/drawingml/2006/main">
+              <a:graphicData uri="http://schemas.openxmlformats.org/drawingml/2006/picture">
+                <pic:pic xmlns:pic="http://schemas.openxmlformats.org/drawingml/2006/picture">
+                  <pic:nvPicPr>
+                    <pic:cNvPr id="357547353" name=""/>
+                    <pic:cNvPicPr/>
+                  </pic:nvPicPr>
+                  <pic:blipFill>
+                    <a:blip r:embed="rId22"/>
+                    <a:stretch>
+                      <a:fillRect/>
+                    </a:stretch>
+                  </pic:blipFill>
+                  <pic:spPr>
+                    <a:xfrm>
+                      <a:off x="0" y="0"/>
+                      <a:ext cx="4156121" cy="2674817"/>
+                    </a:xfrm>
+                    <a:prstGeom prst="rect">
+                      <a:avLst/>
+                    </a:prstGeom>
+                  </pic:spPr>
+                </pic:pic>
+              </a:graphicData>
+            </a:graphic>
+          </wp:inline>
+        </w:drawing>
+      </w:r>
+    </w:p>
+    <w:p>
+      <w:pPr>
+        <w:spacing w:line="360" w:lineRule="auto"/>
+        <w:ind w:left="284"/>
+        <w:rPr>
+          <w:rFonts w:cstheme="minorHAnsi"/>
+          <w:sz w:val="24"/>
+          <w:szCs w:val="24"/>
+        </w:rPr>
+      </w:pPr>
+      <w:r>
+        <w:rPr>
+          <w:rFonts w:cstheme="minorHAnsi"/>
+          <w:b/>
+          <w:bCs/>
+          <w:sz w:val="24"/>
+          <w:szCs w:val="24"/>
+        </w:rPr>
+        <w:t>Step 6: Run the Config Server</w:t>
+      </w:r>
+    </w:p>
+    <w:p>
+      <w:pPr>
+        <w:numPr>
+          <w:ilvl w:val="0"/>
+          <w:numId w:val="22"/>
+        </w:numPr>
+        <w:tabs>
+          <w:tab w:val="clear" w:pos="720"/>
+          <w:tab w:val="num" w:pos="568"/>
+        </w:tabs>
+        <w:spacing w:line="360" w:lineRule="auto"/>
+        <w:ind w:left="568" w:hanging="284"/>
+        <w:rPr>
+          <w:rFonts w:cstheme="minorHAnsi"/>
+          <w:sz w:val="24"/>
+          <w:szCs w:val="24"/>
+        </w:rPr>
+      </w:pPr>
+      <w:r>
+        <w:rPr>
+          <w:rFonts w:cstheme="minorHAnsi"/>
+          <w:sz w:val="24"/>
+          <w:szCs w:val="24"/>
+        </w:rPr>
+        <w:t>Start the Config Server on port 8071.</w:t>
+      </w:r>
+    </w:p>
+    <w:p>
+      <w:pPr>
+        <w:numPr>
+          <w:ilvl w:val="0"/>
+          <w:numId w:val="22"/>
+        </w:numPr>
+        <w:tabs>
+          <w:tab w:val="clear" w:pos="720"/>
+          <w:tab w:val="num" w:pos="568"/>
+        </w:tabs>
+        <w:spacing w:line="360" w:lineRule="auto"/>
+        <w:ind w:left="568" w:hanging="284"/>
+        <w:rPr>
+          <w:rFonts w:cstheme="minorHAnsi"/>
+          <w:sz w:val="24"/>
+          <w:szCs w:val="24"/>
+        </w:rPr>
+      </w:pPr>
+      <w:r>
+        <w:rPr>
+          <w:rFonts w:cstheme="minorHAnsi"/>
+          <w:sz w:val="24"/>
+          <w:szCs w:val="24"/>
+        </w:rPr>
+        <w:t>To verify the setup, navigate to http://localhost:8071/accounts/prod in your browser. This URL requests the configuration details (such as contact-info) for the accounts microservice in the prod environment.</w:t>
+      </w:r>
+    </w:p>
+    <w:p>
+      <w:pPr>
+        <w:numPr>
+          <w:ilvl w:val="0"/>
+          <w:numId w:val="22"/>
+        </w:numPr>
+        <w:tabs>
+          <w:tab w:val="clear" w:pos="720"/>
+          <w:tab w:val="num" w:pos="568"/>
+        </w:tabs>
+        <w:spacing w:line="360" w:lineRule="auto"/>
+        <w:ind w:left="568" w:hanging="284"/>
+        <w:rPr>
+          <w:rFonts w:cstheme="minorHAnsi"/>
+          <w:sz w:val="24"/>
+          <w:szCs w:val="24"/>
+        </w:rPr>
+      </w:pPr>
+      <w:r>
+        <w:rPr>
+          <w:rFonts w:cstheme="minorHAnsi"/>
+          <w:sz w:val="24"/>
+          <w:szCs w:val="24"/>
+        </w:rPr>
+        <w:t>If configured correctly, this endpoint should return the configuration details specific to the requested microservice and environment.</w:t>
+      </w:r>
+    </w:p>
+    <w:p>
+      <w:pPr>
+        <w:spacing w:line="360" w:lineRule="auto"/>
+        <w:ind w:left="644"/>
+        <w:rPr>
+          <w:rFonts w:cstheme="minorHAnsi"/>
+          <w:sz w:val="24"/>
+          <w:szCs w:val="24"/>
+        </w:rPr>
+      </w:pPr>
+      <w:r>
+        <w:rPr>
+          <w:rFonts w:cstheme="minorHAnsi"/>
+          <w:sz w:val="24"/>
+          <w:szCs w:val="24"/>
+        </w:rPr>
+        <w:drawing>
+          <wp:inline distT="0" distB="0" distL="0" distR="0" wp14:anchorId="3D4FBDF6" wp14:editId="5943196F">
+            <wp:extent cx="4559935" cy="3641481"/>
+            <wp:effectExtent l="0" t="0" r="0" b="0"/>
+            <wp:docPr id="1575696390" name="Picture 1"/>
+            <wp:cNvGraphicFramePr>
+              <a:graphicFrameLocks xmlns:a="http://schemas.openxmlformats.org/drawingml/2006/main" noChangeAspect="1"/>
+            </wp:cNvGraphicFramePr>
+            <a:graphic xmlns:a="http://schemas.openxmlformats.org/drawingml/2006/main">
+              <a:graphicData uri="http://schemas.openxmlformats.org/drawingml/2006/picture">
+                <pic:pic xmlns:pic="http://schemas.openxmlformats.org/drawingml/2006/picture">
+                  <pic:nvPicPr>
+                    <pic:cNvPr id="1575696390" name=""/>
+                    <pic:cNvPicPr/>
+                  </pic:nvPicPr>
+                  <pic:blipFill>
+                    <a:blip r:embed="rId23"/>
+                    <a:stretch>
+                      <a:fillRect/>
+                    </a:stretch>
+                  </pic:blipFill>
+                  <pic:spPr>
+                    <a:xfrm>
+                      <a:off x="0" y="0"/>
+                      <a:ext cx="4560618" cy="3642026"/>
+                    </a:xfrm>
+                    <a:prstGeom prst="rect">
+                      <a:avLst/>
+                    </a:prstGeom>
+                  </pic:spPr>
+                </pic:pic>
+              </a:graphicData>
+            </a:graphic>
+          </wp:inline>
+        </w:drawing>
+      </w:r>
+    </w:p>
+    <w:p>
+      <w:pPr>
+        <w:spacing w:line="360" w:lineRule="auto"/>
+        <w:ind w:left="284"/>
+        <w:rPr>
+          <w:rFonts w:cstheme="minorHAnsi"/>
+          <w:sz w:val="24"/>
+          <w:szCs w:val="24"/>
+        </w:rPr>
+      </w:pPr>
+      <w:r>
+        <w:rPr>
+          <w:rFonts w:cstheme="minorHAnsi"/>
+          <w:b/>
+          <w:bCs/>
+          <w:sz w:val="24"/>
+          <w:szCs w:val="24"/>
+        </w:rPr>
+        <w:lastRenderedPageBreak/>
+        <w:t>Step 7: Add Config Server Details to Other Microservices</w:t>
+      </w:r>
+    </w:p>
+    <w:p>
+      <w:pPr>
+        <w:numPr>
+          <w:ilvl w:val="0"/>
+          <w:numId w:val="23"/>
+        </w:numPr>
+        <w:tabs>
+          <w:tab w:val="clear" w:pos="720"/>
+          <w:tab w:val="num" w:pos="1004"/>
+        </w:tabs>
+        <w:spacing w:line="360" w:lineRule="auto"/>
+        <w:ind w:left="1004"/>
+        <w:rPr>
+          <w:rFonts w:cstheme="minorHAnsi"/>
+          <w:sz w:val="24"/>
+          <w:szCs w:val="24"/>
+        </w:rPr>
+      </w:pPr>
+      <w:r>
+        <w:rPr>
+          <w:rFonts w:cstheme="minorHAnsi"/>
+          <w:sz w:val="24"/>
+          <w:szCs w:val="24"/>
+        </w:rPr>
+        <w:t xml:space="preserve">In the </w:t>
+      </w:r>
+      <w:proofErr w:type="spellStart"/>
+      <w:r>
+        <w:rPr>
+          <w:rFonts w:cstheme="minorHAnsi"/>
+          <w:sz w:val="24"/>
+          <w:szCs w:val="24"/>
+        </w:rPr>
+        <w:t>application.yml</w:t>
+      </w:r>
+      <w:proofErr w:type="spellEnd"/>
+      <w:r>
+        <w:rPr>
+          <w:rFonts w:cstheme="minorHAnsi"/>
+          <w:sz w:val="24"/>
+          <w:szCs w:val="24"/>
+        </w:rPr>
+        <w:t xml:space="preserve"> file of each microservice, add the configuration details of the Config Server. This setup ensures that each microservice connects to the Config Server to fetch its configuration upon startup.</w:t>
+      </w:r>
+    </w:p>
+    <w:p>
+      <w:pPr>
+        <w:numPr>
+          <w:ilvl w:val="0"/>
+          <w:numId w:val="23"/>
+        </w:numPr>
+        <w:tabs>
+          <w:tab w:val="clear" w:pos="720"/>
+          <w:tab w:val="num" w:pos="1004"/>
+        </w:tabs>
+        <w:spacing w:line="360" w:lineRule="auto"/>
+        <w:ind w:left="1004"/>
+        <w:rPr>
+          <w:rFonts w:cstheme="minorHAnsi"/>
+          <w:sz w:val="24"/>
+          <w:szCs w:val="24"/>
+        </w:rPr>
+      </w:pPr>
+      <w:r>
+        <w:rPr>
+          <w:rFonts w:cstheme="minorHAnsi"/>
+          <w:sz w:val="24"/>
+          <w:szCs w:val="24"/>
+        </w:rPr>
+        <w:t xml:space="preserve">To control startup dependencies, ensure the Config Server starts before other microservices by specifying it in the configuration. You can make this connection optional by adding optional: true to the </w:t>
+      </w:r>
+      <w:proofErr w:type="spellStart"/>
+      <w:r>
+        <w:rPr>
+          <w:rFonts w:cstheme="minorHAnsi"/>
+          <w:sz w:val="24"/>
+          <w:szCs w:val="24"/>
+        </w:rPr>
+        <w:t>spring.</w:t>
+      </w:r>
+      <w:proofErr w:type="gramStart"/>
+      <w:r>
+        <w:rPr>
+          <w:rFonts w:cstheme="minorHAnsi"/>
+          <w:sz w:val="24"/>
+          <w:szCs w:val="24"/>
+        </w:rPr>
+        <w:t>config.import</w:t>
+      </w:r>
+      <w:proofErr w:type="spellEnd"/>
+      <w:proofErr w:type="gramEnd"/>
+      <w:r>
+        <w:rPr>
+          <w:rFonts w:cstheme="minorHAnsi"/>
+          <w:sz w:val="24"/>
+          <w:szCs w:val="24"/>
+        </w:rPr>
+        <w:t xml:space="preserve"> statement, allowing microservices to start even if the Config Server is temporarily unavailable.</w:t>
+      </w:r>
+    </w:p>
+    <w:p>
+      <w:pPr>
+        <w:spacing w:line="360" w:lineRule="auto"/>
+        <w:ind w:left="1004"/>
+        <w:rPr>
+          <w:rFonts w:cstheme="minorHAnsi"/>
+          <w:sz w:val="24"/>
+          <w:szCs w:val="24"/>
+        </w:rPr>
+      </w:pPr>
+      <w:r>
+        <w:rPr>
+          <w:rFonts w:cstheme="minorHAnsi"/>
+          <w:sz w:val="24"/>
+          <w:szCs w:val="24"/>
+        </w:rPr>
+        <w:drawing>
+          <wp:inline distT="0" distB="0" distL="0" distR="0" wp14:anchorId="7F29C66F" wp14:editId="18934303">
+            <wp:extent cx="5731510" cy="609600"/>
+            <wp:effectExtent l="0" t="0" r="2540" b="0"/>
+            <wp:docPr id="1210303220" name="Picture 1"/>
+            <wp:cNvGraphicFramePr>
+              <a:graphicFrameLocks xmlns:a="http://schemas.openxmlformats.org/drawingml/2006/main" noChangeAspect="1"/>
+            </wp:cNvGraphicFramePr>
+            <a:graphic xmlns:a="http://schemas.openxmlformats.org/drawingml/2006/main">
+              <a:graphicData uri="http://schemas.openxmlformats.org/drawingml/2006/picture">
+                <pic:pic xmlns:pic="http://schemas.openxmlformats.org/drawingml/2006/picture">
+                  <pic:nvPicPr>
+                    <pic:cNvPr id="1210303220" name=""/>
+                    <pic:cNvPicPr/>
+                  </pic:nvPicPr>
+                  <pic:blipFill>
+                    <a:blip r:embed="rId24"/>
+                    <a:stretch>
+                      <a:fillRect/>
+                    </a:stretch>
+                  </pic:blipFill>
+                  <pic:spPr>
+                    <a:xfrm>
+                      <a:off x="0" y="0"/>
+                      <a:ext cx="5731510" cy="609600"/>
+                    </a:xfrm>
+                    <a:prstGeom prst="rect">
+                      <a:avLst/>
+                    </a:prstGeom>
+                  </pic:spPr>
+                </pic:pic>
+              </a:graphicData>
+            </a:graphic>
+          </wp:inline>
+        </w:drawing>
+      </w:r>
+    </w:p>
+    <w:p>
+      <w:pPr>
+        <w:numPr>
+          <w:ilvl w:val="0"/>
+          <w:numId w:val="23"/>
+        </w:numPr>
+        <w:tabs>
+          <w:tab w:val="clear" w:pos="720"/>
+          <w:tab w:val="num" w:pos="1004"/>
+        </w:tabs>
+        <w:spacing w:line="360" w:lineRule="auto"/>
+        <w:ind w:left="1004"/>
+        <w:rPr>
+          <w:rFonts w:cstheme="minorHAnsi"/>
+          <w:sz w:val="24"/>
+          <w:szCs w:val="24"/>
+        </w:rPr>
+      </w:pPr>
+      <w:r>
+        <w:rPr>
+          <w:rFonts w:cstheme="minorHAnsi"/>
+          <w:sz w:val="24"/>
+          <w:szCs w:val="24"/>
+        </w:rPr>
+        <w:t xml:space="preserve">Specify a unique application name for each microservice in the </w:t>
+      </w:r>
+      <w:proofErr w:type="spellStart"/>
+      <w:r>
+        <w:rPr>
+          <w:rFonts w:cstheme="minorHAnsi"/>
+          <w:sz w:val="24"/>
+          <w:szCs w:val="24"/>
+        </w:rPr>
+        <w:t>application.yml</w:t>
+      </w:r>
+      <w:proofErr w:type="spellEnd"/>
+      <w:r>
+        <w:rPr>
+          <w:rFonts w:cstheme="minorHAnsi"/>
+          <w:sz w:val="24"/>
+          <w:szCs w:val="24"/>
+        </w:rPr>
+        <w:t xml:space="preserve"> file, matching the file name format used in the config folder of the Config Server. For example, for the accounts microservice, set application.name: accounts so the Config Server can correctly identify and serve the matching configuration file (like accounts-</w:t>
+      </w:r>
+      <w:proofErr w:type="spellStart"/>
+      <w:r>
+        <w:rPr>
+          <w:rFonts w:cstheme="minorHAnsi"/>
+          <w:sz w:val="24"/>
+          <w:szCs w:val="24"/>
+        </w:rPr>
+        <w:t>prod.yml</w:t>
+      </w:r>
+      <w:proofErr w:type="spellEnd"/>
+      <w:r>
+        <w:rPr>
+          <w:rFonts w:cstheme="minorHAnsi"/>
+          <w:sz w:val="24"/>
+          <w:szCs w:val="24"/>
+        </w:rPr>
+        <w:t xml:space="preserve"> or accounts-</w:t>
+      </w:r>
+      <w:proofErr w:type="spellStart"/>
+      <w:r>
+        <w:rPr>
+          <w:rFonts w:cstheme="minorHAnsi"/>
+          <w:sz w:val="24"/>
+          <w:szCs w:val="24"/>
+        </w:rPr>
+        <w:t>qa.yml</w:t>
+      </w:r>
+      <w:proofErr w:type="spellEnd"/>
+      <w:r>
+        <w:rPr>
+          <w:rFonts w:cstheme="minorHAnsi"/>
+          <w:sz w:val="24"/>
+          <w:szCs w:val="24"/>
+        </w:rPr>
+        <w:t>) based on the environment.</w:t>
+      </w:r>
+      <w:r>
+        <w:rPr>
+          <w:rFonts w:cstheme="minorHAnsi"/>
+          <w:sz w:val="24"/>
+          <w:szCs w:val="24"/>
+        </w:rPr>
+        <w:drawing>
+          <wp:inline distT="0" distB="0" distL="0" distR="0" wp14:anchorId="37ADE40B" wp14:editId="25123CFC">
+            <wp:extent cx="5430008" cy="2314898"/>
+            <wp:effectExtent l="0" t="0" r="0" b="9525"/>
+            <wp:docPr id="1888316544" name="Picture 1"/>
+            <wp:cNvGraphicFramePr>
+              <a:graphicFrameLocks xmlns:a="http://schemas.openxmlformats.org/drawingml/2006/main" noChangeAspect="1"/>
+            </wp:cNvGraphicFramePr>
+            <a:graphic xmlns:a="http://schemas.openxmlformats.org/drawingml/2006/main">
+              <a:graphicData uri="http://schemas.openxmlformats.org/drawingml/2006/picture">
+                <pic:pic xmlns:pic="http://schemas.openxmlformats.org/drawingml/2006/picture">
+                  <pic:nvPicPr>
+                    <pic:cNvPr id="1888316544" name=""/>
+                    <pic:cNvPicPr/>
+                  </pic:nvPicPr>
+                  <pic:blipFill>
+                    <a:blip r:embed="rId25"/>
+                    <a:stretch>
+                      <a:fillRect/>
+                    </a:stretch>
+                  </pic:blipFill>
+                  <pic:spPr>
+                    <a:xfrm>
+                      <a:off x="0" y="0"/>
+                      <a:ext cx="5430008" cy="2314898"/>
+                    </a:xfrm>
+                    <a:prstGeom prst="rect">
+                      <a:avLst/>
+                    </a:prstGeom>
+                  </pic:spPr>
+                </pic:pic>
+              </a:graphicData>
+            </a:graphic>
+          </wp:inline>
+        </w:drawing>
+      </w:r>
+    </w:p>
+    <w:p>
+      <w:pPr>
+        <w:spacing w:line="360" w:lineRule="auto"/>
+        <w:rPr>
+          <w:rFonts w:cstheme="minorHAnsi"/>
+          <w:b/>
+          <w:bCs/>
+          <w:sz w:val="24"/>
+          <w:szCs w:val="24"/>
+        </w:rPr>
+      </w:pPr>
+      <w:r>
+        <w:rPr>
+          <w:rFonts w:cstheme="minorHAnsi"/>
+          <w:b/>
+          <w:bCs/>
+          <w:sz w:val="24"/>
+          <w:szCs w:val="24"/>
+        </w:rPr>
+        <w:t xml:space="preserve">2) Reading Configuration </w:t>
+      </w:r>
+      <w:proofErr w:type="gramStart"/>
+      <w:r>
+        <w:rPr>
+          <w:rFonts w:cstheme="minorHAnsi"/>
+          <w:b/>
+          <w:bCs/>
+          <w:sz w:val="24"/>
+          <w:szCs w:val="24"/>
+        </w:rPr>
+        <w:t>From</w:t>
+      </w:r>
+      <w:proofErr w:type="gramEnd"/>
+      <w:r>
+        <w:rPr>
+          <w:rFonts w:cstheme="minorHAnsi"/>
+          <w:b/>
+          <w:bCs/>
+          <w:sz w:val="24"/>
+          <w:szCs w:val="24"/>
+        </w:rPr>
+        <w:t xml:space="preserve"> Git</w:t>
+      </w:r>
+    </w:p>
+    <w:p>
+      <w:pPr>
+        <w:spacing w:line="360" w:lineRule="auto"/>
+        <w:ind w:left="284"/>
+        <w:rPr>
+          <w:rFonts w:cstheme="minorHAnsi"/>
+          <w:b/>
+          <w:bCs/>
+          <w:sz w:val="24"/>
+          <w:szCs w:val="24"/>
+        </w:rPr>
+      </w:pPr>
+      <w:r>
+        <w:rPr>
+          <w:rFonts w:cstheme="minorHAnsi"/>
+          <w:b/>
+          <w:bCs/>
+          <w:sz w:val="24"/>
+          <w:szCs w:val="24"/>
+        </w:rPr>
+        <w:t>Step 8: Push All Configuration to GitHub</w:t>
+      </w:r>
+    </w:p>
+    <w:p>
+      <w:pPr>
+        <w:numPr>
+          <w:ilvl w:val="0"/>
+          <w:numId w:val="24"/>
+        </w:numPr>
+        <w:spacing w:line="360" w:lineRule="auto"/>
+        <w:rPr>
+          <w:rFonts w:cstheme="minorHAnsi"/>
+          <w:sz w:val="24"/>
+          <w:szCs w:val="24"/>
+        </w:rPr>
+      </w:pPr>
+      <w:r>
+        <w:rPr>
+          <w:rFonts w:cstheme="minorHAnsi"/>
+          <w:sz w:val="24"/>
+          <w:szCs w:val="24"/>
+        </w:rPr>
+        <w:t>Push all configuration files to a private GitHub repository to centralize and secure access to configuration files. This setup prevents developers from accessing configuration files locally, keeping sensitive information safe.</w:t>
+      </w:r>
+    </w:p>
+    <w:p>
+      <w:pPr>
+        <w:numPr>
+          <w:ilvl w:val="0"/>
+          <w:numId w:val="24"/>
+        </w:numPr>
+        <w:spacing w:line="360" w:lineRule="auto"/>
+        <w:rPr>
+          <w:rFonts w:cstheme="minorHAnsi"/>
+          <w:sz w:val="24"/>
+          <w:szCs w:val="24"/>
+        </w:rPr>
+      </w:pPr>
+      <w:r>
+        <w:rPr>
+          <w:rFonts w:cstheme="minorHAnsi"/>
+          <w:sz w:val="24"/>
+          <w:szCs w:val="24"/>
+        </w:rPr>
+        <w:lastRenderedPageBreak/>
+        <w:t xml:space="preserve">In the </w:t>
+      </w:r>
+      <w:proofErr w:type="spellStart"/>
+      <w:r>
+        <w:rPr>
+          <w:rFonts w:cstheme="minorHAnsi"/>
+          <w:sz w:val="24"/>
+          <w:szCs w:val="24"/>
+        </w:rPr>
+        <w:t>application.yml</w:t>
+      </w:r>
+      <w:proofErr w:type="spellEnd"/>
+      <w:r>
+        <w:rPr>
+          <w:rFonts w:cstheme="minorHAnsi"/>
+          <w:sz w:val="24"/>
+          <w:szCs w:val="24"/>
+        </w:rPr>
+        <w:t xml:space="preserve"> file of the Config Server application, configure the following properties:</w:t>
+      </w:r>
+    </w:p>
+    <w:p>
+      <w:pPr>
+        <w:numPr>
+          <w:ilvl w:val="1"/>
+          <w:numId w:val="24"/>
+        </w:numPr>
+        <w:spacing w:line="360" w:lineRule="auto"/>
+        <w:rPr>
+          <w:rFonts w:cstheme="minorHAnsi"/>
+          <w:sz w:val="24"/>
+          <w:szCs w:val="24"/>
+        </w:rPr>
+      </w:pPr>
+      <w:r>
+        <w:rPr>
+          <w:rFonts w:cstheme="minorHAnsi"/>
+          <w:sz w:val="24"/>
+          <w:szCs w:val="24"/>
+        </w:rPr>
+        <w:t xml:space="preserve">Activate Git Profile: Set the </w:t>
+      </w:r>
+      <w:proofErr w:type="spellStart"/>
+      <w:proofErr w:type="gramStart"/>
+      <w:r>
+        <w:rPr>
+          <w:rFonts w:cstheme="minorHAnsi"/>
+          <w:sz w:val="24"/>
+          <w:szCs w:val="24"/>
+        </w:rPr>
+        <w:t>spring.profiles</w:t>
+      </w:r>
+      <w:proofErr w:type="gramEnd"/>
+      <w:r>
+        <w:rPr>
+          <w:rFonts w:cstheme="minorHAnsi"/>
+          <w:sz w:val="24"/>
+          <w:szCs w:val="24"/>
+        </w:rPr>
+        <w:t>.active</w:t>
+      </w:r>
+      <w:proofErr w:type="spellEnd"/>
+      <w:r>
+        <w:rPr>
+          <w:rFonts w:cstheme="minorHAnsi"/>
+          <w:sz w:val="24"/>
+          <w:szCs w:val="24"/>
+        </w:rPr>
+        <w:t xml:space="preserve"> property to git to enable Git-based configuration.</w:t>
+      </w:r>
+    </w:p>
+    <w:p>
+      <w:pPr>
+        <w:numPr>
+          <w:ilvl w:val="1"/>
+          <w:numId w:val="24"/>
+        </w:numPr>
+        <w:spacing w:line="360" w:lineRule="auto"/>
+        <w:rPr>
+          <w:rFonts w:cstheme="minorHAnsi"/>
+          <w:sz w:val="24"/>
+          <w:szCs w:val="24"/>
+        </w:rPr>
+      </w:pPr>
+      <w:r>
+        <w:rPr>
+          <w:rFonts w:cstheme="minorHAnsi"/>
+          <w:sz w:val="24"/>
+          <w:szCs w:val="24"/>
+        </w:rPr>
+        <w:t xml:space="preserve">Git Configuration: In the </w:t>
+      </w:r>
+      <w:proofErr w:type="spellStart"/>
+      <w:proofErr w:type="gramStart"/>
+      <w:r>
+        <w:rPr>
+          <w:rFonts w:cstheme="minorHAnsi"/>
+          <w:sz w:val="24"/>
+          <w:szCs w:val="24"/>
+        </w:rPr>
+        <w:t>spring.cloud</w:t>
+      </w:r>
+      <w:proofErr w:type="gramEnd"/>
+      <w:r>
+        <w:rPr>
+          <w:rFonts w:cstheme="minorHAnsi"/>
+          <w:sz w:val="24"/>
+          <w:szCs w:val="24"/>
+        </w:rPr>
+        <w:t>.config.server</w:t>
+      </w:r>
+      <w:proofErr w:type="spellEnd"/>
+      <w:r>
+        <w:rPr>
+          <w:rFonts w:cstheme="minorHAnsi"/>
+          <w:sz w:val="24"/>
+          <w:szCs w:val="24"/>
+        </w:rPr>
+        <w:t xml:space="preserve"> section, specify git as a child property. Define the </w:t>
+      </w:r>
+      <w:proofErr w:type="spellStart"/>
+      <w:r>
+        <w:rPr>
+          <w:rFonts w:cstheme="minorHAnsi"/>
+          <w:sz w:val="24"/>
+          <w:szCs w:val="24"/>
+        </w:rPr>
+        <w:t>uri</w:t>
+      </w:r>
+      <w:proofErr w:type="spellEnd"/>
+      <w:r>
+        <w:rPr>
+          <w:rFonts w:cstheme="minorHAnsi"/>
+          <w:sz w:val="24"/>
+          <w:szCs w:val="24"/>
+        </w:rPr>
+        <w:t xml:space="preserve"> as the URL of the GitHub repository where the configuration files are stored. Also, set the branch property to the branch containing the configuration files, such as main or prod.</w:t>
+      </w:r>
+    </w:p>
+    <w:bookmarkEnd w:id="0"/>
+    <w:p>
+      <w:pPr>
+        <w:spacing w:line="360" w:lineRule="auto"/>
+        <w:ind w:left="284"/>
+        <w:rPr>
+          <w:rFonts w:cstheme="minorHAnsi"/>
+          <w:sz w:val="24"/>
+          <w:szCs w:val="24"/>
+        </w:rPr>
+      </w:pPr>
+      <w:r>
+        <w:rPr>
+          <w:rFonts w:cstheme="minorHAnsi"/>
+          <w:sz w:val="24"/>
+          <w:szCs w:val="24"/>
+        </w:rPr>
+        <w:drawing>
+          <wp:inline distT="0" distB="0" distL="0" distR="0" wp14:anchorId="2AD8E4C7" wp14:editId="73701219">
+            <wp:extent cx="5731510" cy="3413760"/>
+            <wp:effectExtent l="0" t="0" r="2540" b="0"/>
+            <wp:docPr id="2126910782" name="Picture 1"/>
+            <wp:cNvGraphicFramePr>
+              <a:graphicFrameLocks xmlns:a="http://schemas.openxmlformats.org/drawingml/2006/main" noChangeAspect="1"/>
+            </wp:cNvGraphicFramePr>
+            <a:graphic xmlns:a="http://schemas.openxmlformats.org/drawingml/2006/main">
+              <a:graphicData uri="http://schemas.openxmlformats.org/drawingml/2006/picture">
+                <pic:pic xmlns:pic="http://schemas.openxmlformats.org/drawingml/2006/picture">
+                  <pic:nvPicPr>
+                    <pic:cNvPr id="2126910782" name=""/>
+                    <pic:cNvPicPr/>
+                  </pic:nvPicPr>
+                  <pic:blipFill>
+                    <a:blip r:embed="rId26"/>
+                    <a:stretch>
+                      <a:fillRect/>
+                    </a:stretch>
+                  </pic:blipFill>
+                  <pic:spPr>
+                    <a:xfrm>
+                      <a:off x="0" y="0"/>
+                      <a:ext cx="5731510" cy="3413760"/>
+                    </a:xfrm>
+                    <a:prstGeom prst="rect">
+                      <a:avLst/>
+                    </a:prstGeom>
+                  </pic:spPr>
+                </pic:pic>
+              </a:graphicData>
+            </a:graphic>
+          </wp:inline>
+        </w:drawing>
+      </w:r>
+    </w:p>
     <w:sectPr>
       <w:pgSz w:w="11906" w:h="16838"/>
       <w:pgMar w:top="1440" w:right="1440" w:bottom="1440" w:left="1440" w:header="708" w:footer="708" w:gutter="0"/>
@@ -3511,6 +5139,155 @@
     </w:lvl>
   </w:abstractNum>
   <w:abstractNum w:abstractNumId="2" w15:restartNumberingAfterBreak="0">
+    <w:nsid w:val="121F6F54"/>
+    <w:multiLevelType w:val="multilevel"/>
+    <w:tmpl w:val="69264068"/>
+    <w:lvl w:ilvl="0">
+      <w:start w:val="1"/>
+      <w:numFmt w:val="bullet"/>
+      <w:lvlText w:val=""/>
+      <w:lvlJc w:val="left"/>
+      <w:pPr>
+        <w:tabs>
+          <w:tab w:val="num" w:pos="720"/>
+        </w:tabs>
+        <w:ind w:left="720" w:hanging="360"/>
+      </w:pPr>
+      <w:rPr>
+        <w:rFonts w:ascii="Symbol" w:hAnsi="Symbol" w:hint="default"/>
+        <w:sz w:val="20"/>
+      </w:rPr>
+    </w:lvl>
+    <w:lvl w:ilvl="1" w:tentative="1">
+      <w:start w:val="1"/>
+      <w:numFmt w:val="bullet"/>
+      <w:lvlText w:val="o"/>
+      <w:lvlJc w:val="left"/>
+      <w:pPr>
+        <w:tabs>
+          <w:tab w:val="num" w:pos="1440"/>
+        </w:tabs>
+        <w:ind w:left="1440" w:hanging="360"/>
+      </w:pPr>
+      <w:rPr>
+        <w:rFonts w:ascii="Courier New" w:hAnsi="Courier New" w:hint="default"/>
+        <w:sz w:val="20"/>
+      </w:rPr>
+    </w:lvl>
+    <w:lvl w:ilvl="2" w:tentative="1">
+      <w:start w:val="1"/>
+      <w:numFmt w:val="bullet"/>
+      <w:lvlText w:val=""/>
+      <w:lvlJc w:val="left"/>
+      <w:pPr>
+        <w:tabs>
+          <w:tab w:val="num" w:pos="2160"/>
+        </w:tabs>
+        <w:ind w:left="2160" w:hanging="360"/>
+      </w:pPr>
+      <w:rPr>
+        <w:rFonts w:ascii="Wingdings" w:hAnsi="Wingdings" w:hint="default"/>
+        <w:sz w:val="20"/>
+      </w:rPr>
+    </w:lvl>
+    <w:lvl w:ilvl="3" w:tentative="1">
+      <w:start w:val="1"/>
+      <w:numFmt w:val="bullet"/>
+      <w:lvlText w:val=""/>
+      <w:lvlJc w:val="left"/>
+      <w:pPr>
+        <w:tabs>
+          <w:tab w:val="num" w:pos="2880"/>
+        </w:tabs>
+        <w:ind w:left="2880" w:hanging="360"/>
+      </w:pPr>
+      <w:rPr>
+        <w:rFonts w:ascii="Wingdings" w:hAnsi="Wingdings" w:hint="default"/>
+        <w:sz w:val="20"/>
+      </w:rPr>
+    </w:lvl>
+    <w:lvl w:ilvl="4" w:tentative="1">
+      <w:start w:val="1"/>
+      <w:numFmt w:val="bullet"/>
+      <w:lvlText w:val=""/>
+      <w:lvlJc w:val="left"/>
+      <w:pPr>
+        <w:tabs>
+          <w:tab w:val="num" w:pos="3600"/>
+        </w:tabs>
+        <w:ind w:left="3600" w:hanging="360"/>
+      </w:pPr>
+      <w:rPr>
+        <w:rFonts w:ascii="Wingdings" w:hAnsi="Wingdings" w:hint="default"/>
+        <w:sz w:val="20"/>
+      </w:rPr>
+    </w:lvl>
+    <w:lvl w:ilvl="5" w:tentative="1">
+      <w:start w:val="1"/>
+      <w:numFmt w:val="bullet"/>
+      <w:lvlText w:val=""/>
+      <w:lvlJc w:val="left"/>
+      <w:pPr>
+        <w:tabs>
+          <w:tab w:val="num" w:pos="4320"/>
+        </w:tabs>
+        <w:ind w:left="4320" w:hanging="360"/>
+      </w:pPr>
+      <w:rPr>
+        <w:rFonts w:ascii="Wingdings" w:hAnsi="Wingdings" w:hint="default"/>
+        <w:sz w:val="20"/>
+      </w:rPr>
+    </w:lvl>
+    <w:lvl w:ilvl="6" w:tentative="1">
+      <w:start w:val="1"/>
+      <w:numFmt w:val="bullet"/>
+      <w:lvlText w:val=""/>
+      <w:lvlJc w:val="left"/>
+      <w:pPr>
+        <w:tabs>
+          <w:tab w:val="num" w:pos="5040"/>
+        </w:tabs>
+        <w:ind w:left="5040" w:hanging="360"/>
+      </w:pPr>
+      <w:rPr>
+        <w:rFonts w:ascii="Wingdings" w:hAnsi="Wingdings" w:hint="default"/>
+        <w:sz w:val="20"/>
+      </w:rPr>
+    </w:lvl>
+    <w:lvl w:ilvl="7" w:tentative="1">
+      <w:start w:val="1"/>
+      <w:numFmt w:val="bullet"/>
+      <w:lvlText w:val=""/>
+      <w:lvlJc w:val="left"/>
+      <w:pPr>
+        <w:tabs>
+          <w:tab w:val="num" w:pos="5760"/>
+        </w:tabs>
+        <w:ind w:left="5760" w:hanging="360"/>
+      </w:pPr>
+      <w:rPr>
+        <w:rFonts w:ascii="Wingdings" w:hAnsi="Wingdings" w:hint="default"/>
+        <w:sz w:val="20"/>
+      </w:rPr>
+    </w:lvl>
+    <w:lvl w:ilvl="8" w:tentative="1">
+      <w:start w:val="1"/>
+      <w:numFmt w:val="bullet"/>
+      <w:lvlText w:val=""/>
+      <w:lvlJc w:val="left"/>
+      <w:pPr>
+        <w:tabs>
+          <w:tab w:val="num" w:pos="6480"/>
+        </w:tabs>
+        <w:ind w:left="6480" w:hanging="360"/>
+      </w:pPr>
+      <w:rPr>
+        <w:rFonts w:ascii="Wingdings" w:hAnsi="Wingdings" w:hint="default"/>
+        <w:sz w:val="20"/>
+      </w:rPr>
+    </w:lvl>
+  </w:abstractNum>
+  <w:abstractNum w:abstractNumId="3" w15:restartNumberingAfterBreak="0">
     <w:nsid w:val="13CC25A1"/>
     <w:multiLevelType w:val="hybridMultilevel"/>
     <w:tmpl w:val="3D58C4F0"/>
@@ -3599,7 +5376,7 @@
       </w:pPr>
     </w:lvl>
   </w:abstractNum>
-  <w:abstractNum w:abstractNumId="3" w15:restartNumberingAfterBreak="0">
+  <w:abstractNum w:abstractNumId="4" w15:restartNumberingAfterBreak="0">
     <w:nsid w:val="1B4966DE"/>
     <w:multiLevelType w:val="hybridMultilevel"/>
     <w:tmpl w:val="72AA7EE4"/>
@@ -3689,7 +5466,7 @@
       </w:pPr>
     </w:lvl>
   </w:abstractNum>
-  <w:abstractNum w:abstractNumId="4" w15:restartNumberingAfterBreak="0">
+  <w:abstractNum w:abstractNumId="5" w15:restartNumberingAfterBreak="0">
     <w:nsid w:val="1EE03951"/>
     <w:multiLevelType w:val="hybridMultilevel"/>
     <w:tmpl w:val="D5F00CA2"/>
@@ -3778,7 +5555,7 @@
       </w:pPr>
     </w:lvl>
   </w:abstractNum>
-  <w:abstractNum w:abstractNumId="5" w15:restartNumberingAfterBreak="0">
+  <w:abstractNum w:abstractNumId="6" w15:restartNumberingAfterBreak="0">
     <w:nsid w:val="2ADA3175"/>
     <w:multiLevelType w:val="hybridMultilevel"/>
     <w:tmpl w:val="9D1CECB4"/>
@@ -3867,7 +5644,7 @@
       </w:pPr>
     </w:lvl>
   </w:abstractNum>
-  <w:abstractNum w:abstractNumId="6" w15:restartNumberingAfterBreak="0">
+  <w:abstractNum w:abstractNumId="7" w15:restartNumberingAfterBreak="0">
     <w:nsid w:val="34457A62"/>
     <w:multiLevelType w:val="hybridMultilevel"/>
     <w:tmpl w:val="B4D60810"/>
@@ -3956,7 +5733,156 @@
       </w:pPr>
     </w:lvl>
   </w:abstractNum>
-  <w:abstractNum w:abstractNumId="7" w15:restartNumberingAfterBreak="0">
+  <w:abstractNum w:abstractNumId="8" w15:restartNumberingAfterBreak="0">
+    <w:nsid w:val="3A7C7733"/>
+    <w:multiLevelType w:val="multilevel"/>
+    <w:tmpl w:val="6C6E3ABA"/>
+    <w:lvl w:ilvl="0">
+      <w:start w:val="1"/>
+      <w:numFmt w:val="bullet"/>
+      <w:lvlText w:val=""/>
+      <w:lvlJc w:val="left"/>
+      <w:pPr>
+        <w:tabs>
+          <w:tab w:val="num" w:pos="720"/>
+        </w:tabs>
+        <w:ind w:left="720" w:hanging="360"/>
+      </w:pPr>
+      <w:rPr>
+        <w:rFonts w:ascii="Symbol" w:hAnsi="Symbol" w:hint="default"/>
+        <w:sz w:val="20"/>
+      </w:rPr>
+    </w:lvl>
+    <w:lvl w:ilvl="1" w:tentative="1">
+      <w:start w:val="1"/>
+      <w:numFmt w:val="bullet"/>
+      <w:lvlText w:val="o"/>
+      <w:lvlJc w:val="left"/>
+      <w:pPr>
+        <w:tabs>
+          <w:tab w:val="num" w:pos="1440"/>
+        </w:tabs>
+        <w:ind w:left="1440" w:hanging="360"/>
+      </w:pPr>
+      <w:rPr>
+        <w:rFonts w:ascii="Courier New" w:hAnsi="Courier New" w:hint="default"/>
+        <w:sz w:val="20"/>
+      </w:rPr>
+    </w:lvl>
+    <w:lvl w:ilvl="2" w:tentative="1">
+      <w:start w:val="1"/>
+      <w:numFmt w:val="bullet"/>
+      <w:lvlText w:val=""/>
+      <w:lvlJc w:val="left"/>
+      <w:pPr>
+        <w:tabs>
+          <w:tab w:val="num" w:pos="2160"/>
+        </w:tabs>
+        <w:ind w:left="2160" w:hanging="360"/>
+      </w:pPr>
+      <w:rPr>
+        <w:rFonts w:ascii="Wingdings" w:hAnsi="Wingdings" w:hint="default"/>
+        <w:sz w:val="20"/>
+      </w:rPr>
+    </w:lvl>
+    <w:lvl w:ilvl="3" w:tentative="1">
+      <w:start w:val="1"/>
+      <w:numFmt w:val="bullet"/>
+      <w:lvlText w:val=""/>
+      <w:lvlJc w:val="left"/>
+      <w:pPr>
+        <w:tabs>
+          <w:tab w:val="num" w:pos="2880"/>
+        </w:tabs>
+        <w:ind w:left="2880" w:hanging="360"/>
+      </w:pPr>
+      <w:rPr>
+        <w:rFonts w:ascii="Wingdings" w:hAnsi="Wingdings" w:hint="default"/>
+        <w:sz w:val="20"/>
+      </w:rPr>
+    </w:lvl>
+    <w:lvl w:ilvl="4" w:tentative="1">
+      <w:start w:val="1"/>
+      <w:numFmt w:val="bullet"/>
+      <w:lvlText w:val=""/>
+      <w:lvlJc w:val="left"/>
+      <w:pPr>
+        <w:tabs>
+          <w:tab w:val="num" w:pos="3600"/>
+        </w:tabs>
+        <w:ind w:left="3600" w:hanging="360"/>
+      </w:pPr>
+      <w:rPr>
+        <w:rFonts w:ascii="Wingdings" w:hAnsi="Wingdings" w:hint="default"/>
+        <w:sz w:val="20"/>
+      </w:rPr>
+    </w:lvl>
+    <w:lvl w:ilvl="5" w:tentative="1">
+      <w:start w:val="1"/>
+      <w:numFmt w:val="bullet"/>
+      <w:lvlText w:val=""/>
+      <w:lvlJc w:val="left"/>
+      <w:pPr>
+        <w:tabs>
+          <w:tab w:val="num" w:pos="4320"/>
+        </w:tabs>
+        <w:ind w:left="4320" w:hanging="360"/>
+      </w:pPr>
+      <w:rPr>
+        <w:rFonts w:ascii="Wingdings" w:hAnsi="Wingdings" w:hint="default"/>
+        <w:sz w:val="20"/>
+      </w:rPr>
+    </w:lvl>
+    <w:lvl w:ilvl="6" w:tentative="1">
+      <w:start w:val="1"/>
+      <w:numFmt w:val="bullet"/>
+      <w:lvlText w:val=""/>
+      <w:lvlJc w:val="left"/>
+      <w:pPr>
+        <w:tabs>
+          <w:tab w:val="num" w:pos="5040"/>
+        </w:tabs>
+        <w:ind w:left="5040" w:hanging="360"/>
+      </w:pPr>
+      <w:rPr>
+        <w:rFonts w:ascii="Wingdings" w:hAnsi="Wingdings" w:hint="default"/>
+        <w:sz w:val="20"/>
+      </w:rPr>
+    </w:lvl>
+    <w:lvl w:ilvl="7" w:tentative="1">
+      <w:start w:val="1"/>
+      <w:numFmt w:val="bullet"/>
+      <w:lvlText w:val=""/>
+      <w:lvlJc w:val="left"/>
+      <w:pPr>
+        <w:tabs>
+          <w:tab w:val="num" w:pos="5760"/>
+        </w:tabs>
+        <w:ind w:left="5760" w:hanging="360"/>
+      </w:pPr>
+      <w:rPr>
+        <w:rFonts w:ascii="Wingdings" w:hAnsi="Wingdings" w:hint="default"/>
+        <w:sz w:val="20"/>
+      </w:rPr>
+    </w:lvl>
+    <w:lvl w:ilvl="8" w:tentative="1">
+      <w:start w:val="1"/>
+      <w:numFmt w:val="bullet"/>
+      <w:lvlText w:val=""/>
+      <w:lvlJc w:val="left"/>
+      <w:pPr>
+        <w:tabs>
+          <w:tab w:val="num" w:pos="6480"/>
+        </w:tabs>
+        <w:ind w:left="6480" w:hanging="360"/>
+      </w:pPr>
+      <w:rPr>
+        <w:rFonts w:ascii="Wingdings" w:hAnsi="Wingdings" w:hint="default"/>
+        <w:sz w:val="20"/>
+      </w:rPr>
+    </w:lvl>
+  </w:abstractNum>
+  <w:abstractNum w:abstractNumId="9" w15:restartNumberingAfterBreak="0">
     <w:nsid w:val="46462ED5"/>
     <w:multiLevelType w:val="hybridMultilevel"/>
     <w:tmpl w:val="848A0D22"/>
@@ -4045,7 +5971,7 @@
       </w:pPr>
     </w:lvl>
   </w:abstractNum>
-  <w:abstractNum w:abstractNumId="8" w15:restartNumberingAfterBreak="0">
+  <w:abstractNum w:abstractNumId="10" w15:restartNumberingAfterBreak="0">
     <w:nsid w:val="49E35633"/>
     <w:multiLevelType w:val="multilevel"/>
     <w:tmpl w:val="4D1A433E"/>
@@ -4158,7 +6084,7 @@
       </w:pPr>
     </w:lvl>
   </w:abstractNum>
-  <w:abstractNum w:abstractNumId="9" w15:restartNumberingAfterBreak="0">
+  <w:abstractNum w:abstractNumId="11" w15:restartNumberingAfterBreak="0">
     <w:nsid w:val="4A224F2A"/>
     <w:multiLevelType w:val="hybridMultilevel"/>
     <w:tmpl w:val="0B6ECF04"/>
@@ -4247,7 +6173,752 @@
       </w:pPr>
     </w:lvl>
   </w:abstractNum>
-  <w:abstractNum w:abstractNumId="10" w15:restartNumberingAfterBreak="0">
+  <w:abstractNum w:abstractNumId="12" w15:restartNumberingAfterBreak="0">
+    <w:nsid w:val="50016E34"/>
+    <w:multiLevelType w:val="multilevel"/>
+    <w:tmpl w:val="020E417A"/>
+    <w:lvl w:ilvl="0">
+      <w:start w:val="1"/>
+      <w:numFmt w:val="bullet"/>
+      <w:lvlText w:val=""/>
+      <w:lvlJc w:val="left"/>
+      <w:pPr>
+        <w:tabs>
+          <w:tab w:val="num" w:pos="720"/>
+        </w:tabs>
+        <w:ind w:left="720" w:hanging="360"/>
+      </w:pPr>
+      <w:rPr>
+        <w:rFonts w:ascii="Symbol" w:hAnsi="Symbol" w:hint="default"/>
+        <w:sz w:val="20"/>
+      </w:rPr>
+    </w:lvl>
+    <w:lvl w:ilvl="1" w:tentative="1">
+      <w:start w:val="1"/>
+      <w:numFmt w:val="bullet"/>
+      <w:lvlText w:val="o"/>
+      <w:lvlJc w:val="left"/>
+      <w:pPr>
+        <w:tabs>
+          <w:tab w:val="num" w:pos="1440"/>
+        </w:tabs>
+        <w:ind w:left="1440" w:hanging="360"/>
+      </w:pPr>
+      <w:rPr>
+        <w:rFonts w:ascii="Courier New" w:hAnsi="Courier New" w:hint="default"/>
+        <w:sz w:val="20"/>
+      </w:rPr>
+    </w:lvl>
+    <w:lvl w:ilvl="2" w:tentative="1">
+      <w:start w:val="1"/>
+      <w:numFmt w:val="bullet"/>
+      <w:lvlText w:val=""/>
+      <w:lvlJc w:val="left"/>
+      <w:pPr>
+        <w:tabs>
+          <w:tab w:val="num" w:pos="2160"/>
+        </w:tabs>
+        <w:ind w:left="2160" w:hanging="360"/>
+      </w:pPr>
+      <w:rPr>
+        <w:rFonts w:ascii="Wingdings" w:hAnsi="Wingdings" w:hint="default"/>
+        <w:sz w:val="20"/>
+      </w:rPr>
+    </w:lvl>
+    <w:lvl w:ilvl="3" w:tentative="1">
+      <w:start w:val="1"/>
+      <w:numFmt w:val="bullet"/>
+      <w:lvlText w:val=""/>
+      <w:lvlJc w:val="left"/>
+      <w:pPr>
+        <w:tabs>
+          <w:tab w:val="num" w:pos="2880"/>
+        </w:tabs>
+        <w:ind w:left="2880" w:hanging="360"/>
+      </w:pPr>
+      <w:rPr>
+        <w:rFonts w:ascii="Wingdings" w:hAnsi="Wingdings" w:hint="default"/>
+        <w:sz w:val="20"/>
+      </w:rPr>
+    </w:lvl>
+    <w:lvl w:ilvl="4" w:tentative="1">
+      <w:start w:val="1"/>
+      <w:numFmt w:val="bullet"/>
+      <w:lvlText w:val=""/>
+      <w:lvlJc w:val="left"/>
+      <w:pPr>
+        <w:tabs>
+          <w:tab w:val="num" w:pos="3600"/>
+        </w:tabs>
+        <w:ind w:left="3600" w:hanging="360"/>
+      </w:pPr>
+      <w:rPr>
+        <w:rFonts w:ascii="Wingdings" w:hAnsi="Wingdings" w:hint="default"/>
+        <w:sz w:val="20"/>
+      </w:rPr>
+    </w:lvl>
+    <w:lvl w:ilvl="5" w:tentative="1">
+      <w:start w:val="1"/>
+      <w:numFmt w:val="bullet"/>
+      <w:lvlText w:val=""/>
+      <w:lvlJc w:val="left"/>
+      <w:pPr>
+        <w:tabs>
+          <w:tab w:val="num" w:pos="4320"/>
+        </w:tabs>
+        <w:ind w:left="4320" w:hanging="360"/>
+      </w:pPr>
+      <w:rPr>
+        <w:rFonts w:ascii="Wingdings" w:hAnsi="Wingdings" w:hint="default"/>
+        <w:sz w:val="20"/>
+      </w:rPr>
+    </w:lvl>
+    <w:lvl w:ilvl="6" w:tentative="1">
+      <w:start w:val="1"/>
+      <w:numFmt w:val="bullet"/>
+      <w:lvlText w:val=""/>
+      <w:lvlJc w:val="left"/>
+      <w:pPr>
+        <w:tabs>
+          <w:tab w:val="num" w:pos="5040"/>
+        </w:tabs>
+        <w:ind w:left="5040" w:hanging="360"/>
+      </w:pPr>
+      <w:rPr>
+        <w:rFonts w:ascii="Wingdings" w:hAnsi="Wingdings" w:hint="default"/>
+        <w:sz w:val="20"/>
+      </w:rPr>
+    </w:lvl>
+    <w:lvl w:ilvl="7" w:tentative="1">
+      <w:start w:val="1"/>
+      <w:numFmt w:val="bullet"/>
+      <w:lvlText w:val=""/>
+      <w:lvlJc w:val="left"/>
+      <w:pPr>
+        <w:tabs>
+          <w:tab w:val="num" w:pos="5760"/>
+        </w:tabs>
+        <w:ind w:left="5760" w:hanging="360"/>
+      </w:pPr>
+      <w:rPr>
+        <w:rFonts w:ascii="Wingdings" w:hAnsi="Wingdings" w:hint="default"/>
+        <w:sz w:val="20"/>
+      </w:rPr>
+    </w:lvl>
+    <w:lvl w:ilvl="8" w:tentative="1">
+      <w:start w:val="1"/>
+      <w:numFmt w:val="bullet"/>
+      <w:lvlText w:val=""/>
+      <w:lvlJc w:val="left"/>
+      <w:pPr>
+        <w:tabs>
+          <w:tab w:val="num" w:pos="6480"/>
+        </w:tabs>
+        <w:ind w:left="6480" w:hanging="360"/>
+      </w:pPr>
+      <w:rPr>
+        <w:rFonts w:ascii="Wingdings" w:hAnsi="Wingdings" w:hint="default"/>
+        <w:sz w:val="20"/>
+      </w:rPr>
+    </w:lvl>
+  </w:abstractNum>
+  <w:abstractNum w:abstractNumId="13" w15:restartNumberingAfterBreak="0">
+    <w:nsid w:val="51D929C3"/>
+    <w:multiLevelType w:val="multilevel"/>
+    <w:tmpl w:val="A0B6111C"/>
+    <w:lvl w:ilvl="0">
+      <w:start w:val="1"/>
+      <w:numFmt w:val="bullet"/>
+      <w:lvlText w:val=""/>
+      <w:lvlJc w:val="left"/>
+      <w:pPr>
+        <w:tabs>
+          <w:tab w:val="num" w:pos="720"/>
+        </w:tabs>
+        <w:ind w:left="720" w:hanging="360"/>
+      </w:pPr>
+      <w:rPr>
+        <w:rFonts w:ascii="Symbol" w:hAnsi="Symbol" w:hint="default"/>
+        <w:sz w:val="20"/>
+      </w:rPr>
+    </w:lvl>
+    <w:lvl w:ilvl="1" w:tentative="1">
+      <w:start w:val="1"/>
+      <w:numFmt w:val="bullet"/>
+      <w:lvlText w:val="o"/>
+      <w:lvlJc w:val="left"/>
+      <w:pPr>
+        <w:tabs>
+          <w:tab w:val="num" w:pos="1440"/>
+        </w:tabs>
+        <w:ind w:left="1440" w:hanging="360"/>
+      </w:pPr>
+      <w:rPr>
+        <w:rFonts w:ascii="Courier New" w:hAnsi="Courier New" w:hint="default"/>
+        <w:sz w:val="20"/>
+      </w:rPr>
+    </w:lvl>
+    <w:lvl w:ilvl="2" w:tentative="1">
+      <w:start w:val="1"/>
+      <w:numFmt w:val="bullet"/>
+      <w:lvlText w:val=""/>
+      <w:lvlJc w:val="left"/>
+      <w:pPr>
+        <w:tabs>
+          <w:tab w:val="num" w:pos="2160"/>
+        </w:tabs>
+        <w:ind w:left="2160" w:hanging="360"/>
+      </w:pPr>
+      <w:rPr>
+        <w:rFonts w:ascii="Wingdings" w:hAnsi="Wingdings" w:hint="default"/>
+        <w:sz w:val="20"/>
+      </w:rPr>
+    </w:lvl>
+    <w:lvl w:ilvl="3" w:tentative="1">
+      <w:start w:val="1"/>
+      <w:numFmt w:val="bullet"/>
+      <w:lvlText w:val=""/>
+      <w:lvlJc w:val="left"/>
+      <w:pPr>
+        <w:tabs>
+          <w:tab w:val="num" w:pos="2880"/>
+        </w:tabs>
+        <w:ind w:left="2880" w:hanging="360"/>
+      </w:pPr>
+      <w:rPr>
+        <w:rFonts w:ascii="Wingdings" w:hAnsi="Wingdings" w:hint="default"/>
+        <w:sz w:val="20"/>
+      </w:rPr>
+    </w:lvl>
+    <w:lvl w:ilvl="4" w:tentative="1">
+      <w:start w:val="1"/>
+      <w:numFmt w:val="bullet"/>
+      <w:lvlText w:val=""/>
+      <w:lvlJc w:val="left"/>
+      <w:pPr>
+        <w:tabs>
+          <w:tab w:val="num" w:pos="3600"/>
+        </w:tabs>
+        <w:ind w:left="3600" w:hanging="360"/>
+      </w:pPr>
+      <w:rPr>
+        <w:rFonts w:ascii="Wingdings" w:hAnsi="Wingdings" w:hint="default"/>
+        <w:sz w:val="20"/>
+      </w:rPr>
+    </w:lvl>
+    <w:lvl w:ilvl="5" w:tentative="1">
+      <w:start w:val="1"/>
+      <w:numFmt w:val="bullet"/>
+      <w:lvlText w:val=""/>
+      <w:lvlJc w:val="left"/>
+      <w:pPr>
+        <w:tabs>
+          <w:tab w:val="num" w:pos="4320"/>
+        </w:tabs>
+        <w:ind w:left="4320" w:hanging="360"/>
+      </w:pPr>
+      <w:rPr>
+        <w:rFonts w:ascii="Wingdings" w:hAnsi="Wingdings" w:hint="default"/>
+        <w:sz w:val="20"/>
+      </w:rPr>
+    </w:lvl>
+    <w:lvl w:ilvl="6" w:tentative="1">
+      <w:start w:val="1"/>
+      <w:numFmt w:val="bullet"/>
+      <w:lvlText w:val=""/>
+      <w:lvlJc w:val="left"/>
+      <w:pPr>
+        <w:tabs>
+          <w:tab w:val="num" w:pos="5040"/>
+        </w:tabs>
+        <w:ind w:left="5040" w:hanging="360"/>
+      </w:pPr>
+      <w:rPr>
+        <w:rFonts w:ascii="Wingdings" w:hAnsi="Wingdings" w:hint="default"/>
+        <w:sz w:val="20"/>
+      </w:rPr>
+    </w:lvl>
+    <w:lvl w:ilvl="7" w:tentative="1">
+      <w:start w:val="1"/>
+      <w:numFmt w:val="bullet"/>
+      <w:lvlText w:val=""/>
+      <w:lvlJc w:val="left"/>
+      <w:pPr>
+        <w:tabs>
+          <w:tab w:val="num" w:pos="5760"/>
+        </w:tabs>
+        <w:ind w:left="5760" w:hanging="360"/>
+      </w:pPr>
+      <w:rPr>
+        <w:rFonts w:ascii="Wingdings" w:hAnsi="Wingdings" w:hint="default"/>
+        <w:sz w:val="20"/>
+      </w:rPr>
+    </w:lvl>
+    <w:lvl w:ilvl="8" w:tentative="1">
+      <w:start w:val="1"/>
+      <w:numFmt w:val="bullet"/>
+      <w:lvlText w:val=""/>
+      <w:lvlJc w:val="left"/>
+      <w:pPr>
+        <w:tabs>
+          <w:tab w:val="num" w:pos="6480"/>
+        </w:tabs>
+        <w:ind w:left="6480" w:hanging="360"/>
+      </w:pPr>
+      <w:rPr>
+        <w:rFonts w:ascii="Wingdings" w:hAnsi="Wingdings" w:hint="default"/>
+        <w:sz w:val="20"/>
+      </w:rPr>
+    </w:lvl>
+  </w:abstractNum>
+  <w:abstractNum w:abstractNumId="14" w15:restartNumberingAfterBreak="0">
+    <w:nsid w:val="52D916D8"/>
+    <w:multiLevelType w:val="multilevel"/>
+    <w:tmpl w:val="2C7282FE"/>
+    <w:lvl w:ilvl="0">
+      <w:start w:val="1"/>
+      <w:numFmt w:val="bullet"/>
+      <w:lvlText w:val=""/>
+      <w:lvlJc w:val="left"/>
+      <w:pPr>
+        <w:tabs>
+          <w:tab w:val="num" w:pos="720"/>
+        </w:tabs>
+        <w:ind w:left="720" w:hanging="360"/>
+      </w:pPr>
+      <w:rPr>
+        <w:rFonts w:ascii="Symbol" w:hAnsi="Symbol" w:hint="default"/>
+        <w:sz w:val="20"/>
+      </w:rPr>
+    </w:lvl>
+    <w:lvl w:ilvl="1" w:tentative="1">
+      <w:start w:val="1"/>
+      <w:numFmt w:val="bullet"/>
+      <w:lvlText w:val="o"/>
+      <w:lvlJc w:val="left"/>
+      <w:pPr>
+        <w:tabs>
+          <w:tab w:val="num" w:pos="1440"/>
+        </w:tabs>
+        <w:ind w:left="1440" w:hanging="360"/>
+      </w:pPr>
+      <w:rPr>
+        <w:rFonts w:ascii="Courier New" w:hAnsi="Courier New" w:hint="default"/>
+        <w:sz w:val="20"/>
+      </w:rPr>
+    </w:lvl>
+    <w:lvl w:ilvl="2" w:tentative="1">
+      <w:start w:val="1"/>
+      <w:numFmt w:val="bullet"/>
+      <w:lvlText w:val=""/>
+      <w:lvlJc w:val="left"/>
+      <w:pPr>
+        <w:tabs>
+          <w:tab w:val="num" w:pos="2160"/>
+        </w:tabs>
+        <w:ind w:left="2160" w:hanging="360"/>
+      </w:pPr>
+      <w:rPr>
+        <w:rFonts w:ascii="Wingdings" w:hAnsi="Wingdings" w:hint="default"/>
+        <w:sz w:val="20"/>
+      </w:rPr>
+    </w:lvl>
+    <w:lvl w:ilvl="3" w:tentative="1">
+      <w:start w:val="1"/>
+      <w:numFmt w:val="bullet"/>
+      <w:lvlText w:val=""/>
+      <w:lvlJc w:val="left"/>
+      <w:pPr>
+        <w:tabs>
+          <w:tab w:val="num" w:pos="2880"/>
+        </w:tabs>
+        <w:ind w:left="2880" w:hanging="360"/>
+      </w:pPr>
+      <w:rPr>
+        <w:rFonts w:ascii="Wingdings" w:hAnsi="Wingdings" w:hint="default"/>
+        <w:sz w:val="20"/>
+      </w:rPr>
+    </w:lvl>
+    <w:lvl w:ilvl="4" w:tentative="1">
+      <w:start w:val="1"/>
+      <w:numFmt w:val="bullet"/>
+      <w:lvlText w:val=""/>
+      <w:lvlJc w:val="left"/>
+      <w:pPr>
+        <w:tabs>
+          <w:tab w:val="num" w:pos="3600"/>
+        </w:tabs>
+        <w:ind w:left="3600" w:hanging="360"/>
+      </w:pPr>
+      <w:rPr>
+        <w:rFonts w:ascii="Wingdings" w:hAnsi="Wingdings" w:hint="default"/>
+        <w:sz w:val="20"/>
+      </w:rPr>
+    </w:lvl>
+    <w:lvl w:ilvl="5" w:tentative="1">
+      <w:start w:val="1"/>
+      <w:numFmt w:val="bullet"/>
+      <w:lvlText w:val=""/>
+      <w:lvlJc w:val="left"/>
+      <w:pPr>
+        <w:tabs>
+          <w:tab w:val="num" w:pos="4320"/>
+        </w:tabs>
+        <w:ind w:left="4320" w:hanging="360"/>
+      </w:pPr>
+      <w:rPr>
+        <w:rFonts w:ascii="Wingdings" w:hAnsi="Wingdings" w:hint="default"/>
+        <w:sz w:val="20"/>
+      </w:rPr>
+    </w:lvl>
+    <w:lvl w:ilvl="6" w:tentative="1">
+      <w:start w:val="1"/>
+      <w:numFmt w:val="bullet"/>
+      <w:lvlText w:val=""/>
+      <w:lvlJc w:val="left"/>
+      <w:pPr>
+        <w:tabs>
+          <w:tab w:val="num" w:pos="5040"/>
+        </w:tabs>
+        <w:ind w:left="5040" w:hanging="360"/>
+      </w:pPr>
+      <w:rPr>
+        <w:rFonts w:ascii="Wingdings" w:hAnsi="Wingdings" w:hint="default"/>
+        <w:sz w:val="20"/>
+      </w:rPr>
+    </w:lvl>
+    <w:lvl w:ilvl="7" w:tentative="1">
+      <w:start w:val="1"/>
+      <w:numFmt w:val="bullet"/>
+      <w:lvlText w:val=""/>
+      <w:lvlJc w:val="left"/>
+      <w:pPr>
+        <w:tabs>
+          <w:tab w:val="num" w:pos="5760"/>
+        </w:tabs>
+        <w:ind w:left="5760" w:hanging="360"/>
+      </w:pPr>
+      <w:rPr>
+        <w:rFonts w:ascii="Wingdings" w:hAnsi="Wingdings" w:hint="default"/>
+        <w:sz w:val="20"/>
+      </w:rPr>
+    </w:lvl>
+    <w:lvl w:ilvl="8" w:tentative="1">
+      <w:start w:val="1"/>
+      <w:numFmt w:val="bullet"/>
+      <w:lvlText w:val=""/>
+      <w:lvlJc w:val="left"/>
+      <w:pPr>
+        <w:tabs>
+          <w:tab w:val="num" w:pos="6480"/>
+        </w:tabs>
+        <w:ind w:left="6480" w:hanging="360"/>
+      </w:pPr>
+      <w:rPr>
+        <w:rFonts w:ascii="Wingdings" w:hAnsi="Wingdings" w:hint="default"/>
+        <w:sz w:val="20"/>
+      </w:rPr>
+    </w:lvl>
+  </w:abstractNum>
+  <w:abstractNum w:abstractNumId="15" w15:restartNumberingAfterBreak="0">
+    <w:nsid w:val="5348351D"/>
+    <w:multiLevelType w:val="multilevel"/>
+    <w:tmpl w:val="C24452C6"/>
+    <w:lvl w:ilvl="0">
+      <w:start w:val="1"/>
+      <w:numFmt w:val="bullet"/>
+      <w:lvlText w:val=""/>
+      <w:lvlJc w:val="left"/>
+      <w:pPr>
+        <w:tabs>
+          <w:tab w:val="num" w:pos="720"/>
+        </w:tabs>
+        <w:ind w:left="720" w:hanging="360"/>
+      </w:pPr>
+      <w:rPr>
+        <w:rFonts w:ascii="Symbol" w:hAnsi="Symbol" w:hint="default"/>
+        <w:sz w:val="20"/>
+      </w:rPr>
+    </w:lvl>
+    <w:lvl w:ilvl="1" w:tentative="1">
+      <w:start w:val="1"/>
+      <w:numFmt w:val="bullet"/>
+      <w:lvlText w:val="o"/>
+      <w:lvlJc w:val="left"/>
+      <w:pPr>
+        <w:tabs>
+          <w:tab w:val="num" w:pos="1440"/>
+        </w:tabs>
+        <w:ind w:left="1440" w:hanging="360"/>
+      </w:pPr>
+      <w:rPr>
+        <w:rFonts w:ascii="Courier New" w:hAnsi="Courier New" w:hint="default"/>
+        <w:sz w:val="20"/>
+      </w:rPr>
+    </w:lvl>
+    <w:lvl w:ilvl="2" w:tentative="1">
+      <w:start w:val="1"/>
+      <w:numFmt w:val="bullet"/>
+      <w:lvlText w:val=""/>
+      <w:lvlJc w:val="left"/>
+      <w:pPr>
+        <w:tabs>
+          <w:tab w:val="num" w:pos="2160"/>
+        </w:tabs>
+        <w:ind w:left="2160" w:hanging="360"/>
+      </w:pPr>
+      <w:rPr>
+        <w:rFonts w:ascii="Wingdings" w:hAnsi="Wingdings" w:hint="default"/>
+        <w:sz w:val="20"/>
+      </w:rPr>
+    </w:lvl>
+    <w:lvl w:ilvl="3" w:tentative="1">
+      <w:start w:val="1"/>
+      <w:numFmt w:val="bullet"/>
+      <w:lvlText w:val=""/>
+      <w:lvlJc w:val="left"/>
+      <w:pPr>
+        <w:tabs>
+          <w:tab w:val="num" w:pos="2880"/>
+        </w:tabs>
+        <w:ind w:left="2880" w:hanging="360"/>
+      </w:pPr>
+      <w:rPr>
+        <w:rFonts w:ascii="Wingdings" w:hAnsi="Wingdings" w:hint="default"/>
+        <w:sz w:val="20"/>
+      </w:rPr>
+    </w:lvl>
+    <w:lvl w:ilvl="4" w:tentative="1">
+      <w:start w:val="1"/>
+      <w:numFmt w:val="bullet"/>
+      <w:lvlText w:val=""/>
+      <w:lvlJc w:val="left"/>
+      <w:pPr>
+        <w:tabs>
+          <w:tab w:val="num" w:pos="3600"/>
+        </w:tabs>
+        <w:ind w:left="3600" w:hanging="360"/>
+      </w:pPr>
+      <w:rPr>
+        <w:rFonts w:ascii="Wingdings" w:hAnsi="Wingdings" w:hint="default"/>
+        <w:sz w:val="20"/>
+      </w:rPr>
+    </w:lvl>
+    <w:lvl w:ilvl="5" w:tentative="1">
+      <w:start w:val="1"/>
+      <w:numFmt w:val="bullet"/>
+      <w:lvlText w:val=""/>
+      <w:lvlJc w:val="left"/>
+      <w:pPr>
+        <w:tabs>
+          <w:tab w:val="num" w:pos="4320"/>
+        </w:tabs>
+        <w:ind w:left="4320" w:hanging="360"/>
+      </w:pPr>
+      <w:rPr>
+        <w:rFonts w:ascii="Wingdings" w:hAnsi="Wingdings" w:hint="default"/>
+        <w:sz w:val="20"/>
+      </w:rPr>
+    </w:lvl>
+    <w:lvl w:ilvl="6" w:tentative="1">
+      <w:start w:val="1"/>
+      <w:numFmt w:val="bullet"/>
+      <w:lvlText w:val=""/>
+      <w:lvlJc w:val="left"/>
+      <w:pPr>
+        <w:tabs>
+          <w:tab w:val="num" w:pos="5040"/>
+        </w:tabs>
+        <w:ind w:left="5040" w:hanging="360"/>
+      </w:pPr>
+      <w:rPr>
+        <w:rFonts w:ascii="Wingdings" w:hAnsi="Wingdings" w:hint="default"/>
+        <w:sz w:val="20"/>
+      </w:rPr>
+    </w:lvl>
+    <w:lvl w:ilvl="7" w:tentative="1">
+      <w:start w:val="1"/>
+      <w:numFmt w:val="bullet"/>
+      <w:lvlText w:val=""/>
+      <w:lvlJc w:val="left"/>
+      <w:pPr>
+        <w:tabs>
+          <w:tab w:val="num" w:pos="5760"/>
+        </w:tabs>
+        <w:ind w:left="5760" w:hanging="360"/>
+      </w:pPr>
+      <w:rPr>
+        <w:rFonts w:ascii="Wingdings" w:hAnsi="Wingdings" w:hint="default"/>
+        <w:sz w:val="20"/>
+      </w:rPr>
+    </w:lvl>
+    <w:lvl w:ilvl="8" w:tentative="1">
+      <w:start w:val="1"/>
+      <w:numFmt w:val="bullet"/>
+      <w:lvlText w:val=""/>
+      <w:lvlJc w:val="left"/>
+      <w:pPr>
+        <w:tabs>
+          <w:tab w:val="num" w:pos="6480"/>
+        </w:tabs>
+        <w:ind w:left="6480" w:hanging="360"/>
+      </w:pPr>
+      <w:rPr>
+        <w:rFonts w:ascii="Wingdings" w:hAnsi="Wingdings" w:hint="default"/>
+        <w:sz w:val="20"/>
+      </w:rPr>
+    </w:lvl>
+  </w:abstractNum>
+  <w:abstractNum w:abstractNumId="16" w15:restartNumberingAfterBreak="0">
+    <w:nsid w:val="5E925DD0"/>
+    <w:multiLevelType w:val="multilevel"/>
+    <w:tmpl w:val="8F0E83C2"/>
+    <w:lvl w:ilvl="0">
+      <w:start w:val="1"/>
+      <w:numFmt w:val="bullet"/>
+      <w:lvlText w:val=""/>
+      <w:lvlJc w:val="left"/>
+      <w:pPr>
+        <w:tabs>
+          <w:tab w:val="num" w:pos="720"/>
+        </w:tabs>
+        <w:ind w:left="720" w:hanging="360"/>
+      </w:pPr>
+      <w:rPr>
+        <w:rFonts w:ascii="Symbol" w:hAnsi="Symbol" w:hint="default"/>
+        <w:sz w:val="20"/>
+      </w:rPr>
+    </w:lvl>
+    <w:lvl w:ilvl="1" w:tentative="1">
+      <w:start w:val="1"/>
+      <w:numFmt w:val="bullet"/>
+      <w:lvlText w:val="o"/>
+      <w:lvlJc w:val="left"/>
+      <w:pPr>
+        <w:tabs>
+          <w:tab w:val="num" w:pos="1440"/>
+        </w:tabs>
+        <w:ind w:left="1440" w:hanging="360"/>
+      </w:pPr>
+      <w:rPr>
+        <w:rFonts w:ascii="Courier New" w:hAnsi="Courier New" w:hint="default"/>
+        <w:sz w:val="20"/>
+      </w:rPr>
+    </w:lvl>
+    <w:lvl w:ilvl="2" w:tentative="1">
+      <w:start w:val="1"/>
+      <w:numFmt w:val="bullet"/>
+      <w:lvlText w:val=""/>
+      <w:lvlJc w:val="left"/>
+      <w:pPr>
+        <w:tabs>
+          <w:tab w:val="num" w:pos="2160"/>
+        </w:tabs>
+        <w:ind w:left="2160" w:hanging="360"/>
+      </w:pPr>
+      <w:rPr>
+        <w:rFonts w:ascii="Wingdings" w:hAnsi="Wingdings" w:hint="default"/>
+        <w:sz w:val="20"/>
+      </w:rPr>
+    </w:lvl>
+    <w:lvl w:ilvl="3" w:tentative="1">
+      <w:start w:val="1"/>
+      <w:numFmt w:val="bullet"/>
+      <w:lvlText w:val=""/>
+      <w:lvlJc w:val="left"/>
+      <w:pPr>
+        <w:tabs>
+          <w:tab w:val="num" w:pos="2880"/>
+        </w:tabs>
+        <w:ind w:left="2880" w:hanging="360"/>
+      </w:pPr>
+      <w:rPr>
+        <w:rFonts w:ascii="Wingdings" w:hAnsi="Wingdings" w:hint="default"/>
+        <w:sz w:val="20"/>
+      </w:rPr>
+    </w:lvl>
+    <w:lvl w:ilvl="4" w:tentative="1">
+      <w:start w:val="1"/>
+      <w:numFmt w:val="bullet"/>
+      <w:lvlText w:val=""/>
+      <w:lvlJc w:val="left"/>
+      <w:pPr>
+        <w:tabs>
+          <w:tab w:val="num" w:pos="3600"/>
+        </w:tabs>
+        <w:ind w:left="3600" w:hanging="360"/>
+      </w:pPr>
+      <w:rPr>
+        <w:rFonts w:ascii="Wingdings" w:hAnsi="Wingdings" w:hint="default"/>
+        <w:sz w:val="20"/>
+      </w:rPr>
+    </w:lvl>
+    <w:lvl w:ilvl="5" w:tentative="1">
+      <w:start w:val="1"/>
+      <w:numFmt w:val="bullet"/>
+      <w:lvlText w:val=""/>
+      <w:lvlJc w:val="left"/>
+      <w:pPr>
+        <w:tabs>
+          <w:tab w:val="num" w:pos="4320"/>
+        </w:tabs>
+        <w:ind w:left="4320" w:hanging="360"/>
+      </w:pPr>
+      <w:rPr>
+        <w:rFonts w:ascii="Wingdings" w:hAnsi="Wingdings" w:hint="default"/>
+        <w:sz w:val="20"/>
+      </w:rPr>
+    </w:lvl>
+    <w:lvl w:ilvl="6" w:tentative="1">
+      <w:start w:val="1"/>
+      <w:numFmt w:val="bullet"/>
+      <w:lvlText w:val=""/>
+      <w:lvlJc w:val="left"/>
+      <w:pPr>
+        <w:tabs>
+          <w:tab w:val="num" w:pos="5040"/>
+        </w:tabs>
+        <w:ind w:left="5040" w:hanging="360"/>
+      </w:pPr>
+      <w:rPr>
+        <w:rFonts w:ascii="Wingdings" w:hAnsi="Wingdings" w:hint="default"/>
+        <w:sz w:val="20"/>
+      </w:rPr>
+    </w:lvl>
+    <w:lvl w:ilvl="7" w:tentative="1">
+      <w:start w:val="1"/>
+      <w:numFmt w:val="bullet"/>
+      <w:lvlText w:val=""/>
+      <w:lvlJc w:val="left"/>
+      <w:pPr>
+        <w:tabs>
+          <w:tab w:val="num" w:pos="5760"/>
+        </w:tabs>
+        <w:ind w:left="5760" w:hanging="360"/>
+      </w:pPr>
+      <w:rPr>
+        <w:rFonts w:ascii="Wingdings" w:hAnsi="Wingdings" w:hint="default"/>
+        <w:sz w:val="20"/>
+      </w:rPr>
+    </w:lvl>
+    <w:lvl w:ilvl="8" w:tentative="1">
+      <w:start w:val="1"/>
+      <w:numFmt w:val="bullet"/>
+      <w:lvlText w:val=""/>
+      <w:lvlJc w:val="left"/>
+      <w:pPr>
+        <w:tabs>
+          <w:tab w:val="num" w:pos="6480"/>
+        </w:tabs>
+        <w:ind w:left="6480" w:hanging="360"/>
+      </w:pPr>
+      <w:rPr>
+        <w:rFonts w:ascii="Wingdings" w:hAnsi="Wingdings" w:hint="default"/>
+        <w:sz w:val="20"/>
+      </w:rPr>
+    </w:lvl>
+  </w:abstractNum>
+  <w:abstractNum w:abstractNumId="17" w15:restartNumberingAfterBreak="0">
     <w:nsid w:val="618D3231"/>
     <w:multiLevelType w:val="multilevel"/>
     <w:tmpl w:val="9A9E3B86"/>
@@ -4396,7 +7067,7 @@
       </w:rPr>
     </w:lvl>
   </w:abstractNum>
-  <w:abstractNum w:abstractNumId="11" w15:restartNumberingAfterBreak="0">
+  <w:abstractNum w:abstractNumId="18" w15:restartNumberingAfterBreak="0">
     <w:nsid w:val="675E444E"/>
     <w:multiLevelType w:val="multilevel"/>
     <w:tmpl w:val="720E20CC"/>
@@ -4509,7 +7180,7 @@
       </w:pPr>
     </w:lvl>
   </w:abstractNum>
-  <w:abstractNum w:abstractNumId="12" w15:restartNumberingAfterBreak="0">
+  <w:abstractNum w:abstractNumId="19" w15:restartNumberingAfterBreak="0">
     <w:nsid w:val="69EE1487"/>
     <w:multiLevelType w:val="multilevel"/>
     <w:tmpl w:val="64F6CDE0"/>
@@ -4658,7 +7329,7 @@
       </w:rPr>
     </w:lvl>
   </w:abstractNum>
-  <w:abstractNum w:abstractNumId="13" w15:restartNumberingAfterBreak="0">
+  <w:abstractNum w:abstractNumId="20" w15:restartNumberingAfterBreak="0">
     <w:nsid w:val="6C315F94"/>
     <w:multiLevelType w:val="multilevel"/>
     <w:tmpl w:val="179C1B76"/>
@@ -4771,7 +7442,7 @@
       </w:pPr>
     </w:lvl>
   </w:abstractNum>
-  <w:abstractNum w:abstractNumId="14" w15:restartNumberingAfterBreak="0">
+  <w:abstractNum w:abstractNumId="21" w15:restartNumberingAfterBreak="0">
     <w:nsid w:val="6D397FA9"/>
     <w:multiLevelType w:val="multilevel"/>
     <w:tmpl w:val="77127E50"/>
@@ -4884,7 +7555,156 @@
       </w:pPr>
     </w:lvl>
   </w:abstractNum>
-  <w:abstractNum w:abstractNumId="15" w15:restartNumberingAfterBreak="0">
+  <w:abstractNum w:abstractNumId="22" w15:restartNumberingAfterBreak="0">
+    <w:nsid w:val="74E30C48"/>
+    <w:multiLevelType w:val="multilevel"/>
+    <w:tmpl w:val="A90A7CCA"/>
+    <w:lvl w:ilvl="0">
+      <w:start w:val="1"/>
+      <w:numFmt w:val="bullet"/>
+      <w:lvlText w:val=""/>
+      <w:lvlJc w:val="left"/>
+      <w:pPr>
+        <w:tabs>
+          <w:tab w:val="num" w:pos="720"/>
+        </w:tabs>
+        <w:ind w:left="720" w:hanging="360"/>
+      </w:pPr>
+      <w:rPr>
+        <w:rFonts w:ascii="Symbol" w:hAnsi="Symbol" w:hint="default"/>
+        <w:sz w:val="20"/>
+      </w:rPr>
+    </w:lvl>
+    <w:lvl w:ilvl="1">
+      <w:start w:val="1"/>
+      <w:numFmt w:val="bullet"/>
+      <w:lvlText w:val="o"/>
+      <w:lvlJc w:val="left"/>
+      <w:pPr>
+        <w:tabs>
+          <w:tab w:val="num" w:pos="1440"/>
+        </w:tabs>
+        <w:ind w:left="1440" w:hanging="360"/>
+      </w:pPr>
+      <w:rPr>
+        <w:rFonts w:ascii="Courier New" w:hAnsi="Courier New" w:hint="default"/>
+        <w:sz w:val="20"/>
+      </w:rPr>
+    </w:lvl>
+    <w:lvl w:ilvl="2" w:tentative="1">
+      <w:start w:val="1"/>
+      <w:numFmt w:val="bullet"/>
+      <w:lvlText w:val=""/>
+      <w:lvlJc w:val="left"/>
+      <w:pPr>
+        <w:tabs>
+          <w:tab w:val="num" w:pos="2160"/>
+        </w:tabs>
+        <w:ind w:left="2160" w:hanging="360"/>
+      </w:pPr>
+      <w:rPr>
+        <w:rFonts w:ascii="Wingdings" w:hAnsi="Wingdings" w:hint="default"/>
+        <w:sz w:val="20"/>
+      </w:rPr>
+    </w:lvl>
+    <w:lvl w:ilvl="3" w:tentative="1">
+      <w:start w:val="1"/>
+      <w:numFmt w:val="bullet"/>
+      <w:lvlText w:val=""/>
+      <w:lvlJc w:val="left"/>
+      <w:pPr>
+        <w:tabs>
+          <w:tab w:val="num" w:pos="2880"/>
+        </w:tabs>
+        <w:ind w:left="2880" w:hanging="360"/>
+      </w:pPr>
+      <w:rPr>
+        <w:rFonts w:ascii="Wingdings" w:hAnsi="Wingdings" w:hint="default"/>
+        <w:sz w:val="20"/>
+      </w:rPr>
+    </w:lvl>
+    <w:lvl w:ilvl="4" w:tentative="1">
+      <w:start w:val="1"/>
+      <w:numFmt w:val="bullet"/>
+      <w:lvlText w:val=""/>
+      <w:lvlJc w:val="left"/>
+      <w:pPr>
+        <w:tabs>
+          <w:tab w:val="num" w:pos="3600"/>
+        </w:tabs>
+        <w:ind w:left="3600" w:hanging="360"/>
+      </w:pPr>
+      <w:rPr>
+        <w:rFonts w:ascii="Wingdings" w:hAnsi="Wingdings" w:hint="default"/>
+        <w:sz w:val="20"/>
+      </w:rPr>
+    </w:lvl>
+    <w:lvl w:ilvl="5" w:tentative="1">
+      <w:start w:val="1"/>
+      <w:numFmt w:val="bullet"/>
+      <w:lvlText w:val=""/>
+      <w:lvlJc w:val="left"/>
+      <w:pPr>
+        <w:tabs>
+          <w:tab w:val="num" w:pos="4320"/>
+        </w:tabs>
+        <w:ind w:left="4320" w:hanging="360"/>
+      </w:pPr>
+      <w:rPr>
+        <w:rFonts w:ascii="Wingdings" w:hAnsi="Wingdings" w:hint="default"/>
+        <w:sz w:val="20"/>
+      </w:rPr>
+    </w:lvl>
+    <w:lvl w:ilvl="6" w:tentative="1">
+      <w:start w:val="1"/>
+      <w:numFmt w:val="bullet"/>
+      <w:lvlText w:val=""/>
+      <w:lvlJc w:val="left"/>
+      <w:pPr>
+        <w:tabs>
+          <w:tab w:val="num" w:pos="5040"/>
+        </w:tabs>
+        <w:ind w:left="5040" w:hanging="360"/>
+      </w:pPr>
+      <w:rPr>
+        <w:rFonts w:ascii="Wingdings" w:hAnsi="Wingdings" w:hint="default"/>
+        <w:sz w:val="20"/>
+      </w:rPr>
+    </w:lvl>
+    <w:lvl w:ilvl="7" w:tentative="1">
+      <w:start w:val="1"/>
+      <w:numFmt w:val="bullet"/>
+      <w:lvlText w:val=""/>
+      <w:lvlJc w:val="left"/>
+      <w:pPr>
+        <w:tabs>
+          <w:tab w:val="num" w:pos="5760"/>
+        </w:tabs>
+        <w:ind w:left="5760" w:hanging="360"/>
+      </w:pPr>
+      <w:rPr>
+        <w:rFonts w:ascii="Wingdings" w:hAnsi="Wingdings" w:hint="default"/>
+        <w:sz w:val="20"/>
+      </w:rPr>
+    </w:lvl>
+    <w:lvl w:ilvl="8" w:tentative="1">
+      <w:start w:val="1"/>
+      <w:numFmt w:val="bullet"/>
+      <w:lvlText w:val=""/>
+      <w:lvlJc w:val="left"/>
+      <w:pPr>
+        <w:tabs>
+          <w:tab w:val="num" w:pos="6480"/>
+        </w:tabs>
+        <w:ind w:left="6480" w:hanging="360"/>
+      </w:pPr>
+      <w:rPr>
+        <w:rFonts w:ascii="Wingdings" w:hAnsi="Wingdings" w:hint="default"/>
+        <w:sz w:val="20"/>
+      </w:rPr>
+    </w:lvl>
+  </w:abstractNum>
+  <w:abstractNum w:abstractNumId="23" w15:restartNumberingAfterBreak="0">
     <w:nsid w:val="79F04B5D"/>
     <w:multiLevelType w:val="multilevel"/>
     <w:tmpl w:val="0824C70C"/>
@@ -4998,10 +7818,10 @@
     </w:lvl>
   </w:abstractNum>
   <w:num w:numId="1" w16cid:durableId="1332105865">
-    <w:abstractNumId w:val="2"/>
+    <w:abstractNumId w:val="3"/>
   </w:num>
   <w:num w:numId="2" w16cid:durableId="1616669310">
-    <w:abstractNumId w:val="5"/>
+    <w:abstractNumId w:val="6"/>
   </w:num>
   <w:num w:numId="3" w16cid:durableId="554049269">
     <w:abstractNumId w:val="0"/>
@@ -5010,40 +7830,64 @@
     <w:abstractNumId w:val="1"/>
   </w:num>
   <w:num w:numId="5" w16cid:durableId="362445369">
+    <w:abstractNumId w:val="11"/>
+  </w:num>
+  <w:num w:numId="6" w16cid:durableId="114561700">
+    <w:abstractNumId w:val="7"/>
+  </w:num>
+  <w:num w:numId="7" w16cid:durableId="1740052770">
+    <w:abstractNumId w:val="5"/>
+  </w:num>
+  <w:num w:numId="8" w16cid:durableId="1742408415">
+    <w:abstractNumId w:val="23"/>
+  </w:num>
+  <w:num w:numId="9" w16cid:durableId="649556091">
+    <w:abstractNumId w:val="10"/>
+  </w:num>
+  <w:num w:numId="10" w16cid:durableId="1567377984">
     <w:abstractNumId w:val="9"/>
   </w:num>
-  <w:num w:numId="6" w16cid:durableId="114561700">
-    <w:abstractNumId w:val="6"/>
+  <w:num w:numId="11" w16cid:durableId="1353724759">
+    <w:abstractNumId w:val="18"/>
   </w:num>
-  <w:num w:numId="7" w16cid:durableId="1740052770">
+  <w:num w:numId="12" w16cid:durableId="1603489458">
+    <w:abstractNumId w:val="20"/>
+  </w:num>
+  <w:num w:numId="13" w16cid:durableId="569385878">
+    <w:abstractNumId w:val="21"/>
+  </w:num>
+  <w:num w:numId="14" w16cid:durableId="2125492633">
     <w:abstractNumId w:val="4"/>
   </w:num>
-  <w:num w:numId="8" w16cid:durableId="1742408415">
+  <w:num w:numId="15" w16cid:durableId="2102753963">
+    <w:abstractNumId w:val="17"/>
+  </w:num>
+  <w:num w:numId="16" w16cid:durableId="1615818457">
+    <w:abstractNumId w:val="19"/>
+  </w:num>
+  <w:num w:numId="17" w16cid:durableId="1930582642">
+    <w:abstractNumId w:val="14"/>
+  </w:num>
+  <w:num w:numId="18" w16cid:durableId="1769882542">
+    <w:abstractNumId w:val="13"/>
+  </w:num>
+  <w:num w:numId="19" w16cid:durableId="971668531">
+    <w:abstractNumId w:val="8"/>
+  </w:num>
+  <w:num w:numId="20" w16cid:durableId="1032725787">
+    <w:abstractNumId w:val="12"/>
+  </w:num>
+  <w:num w:numId="21" w16cid:durableId="2037344762">
     <w:abstractNumId w:val="15"/>
   </w:num>
-  <w:num w:numId="9" w16cid:durableId="649556091">
-    <w:abstractNumId w:val="8"/>
+  <w:num w:numId="22" w16cid:durableId="322899923">
+    <w:abstractNumId w:val="2"/>
   </w:num>
-  <w:num w:numId="10" w16cid:durableId="1567377984">
-    <w:abstractNumId w:val="7"/>
+  <w:num w:numId="23" w16cid:durableId="606936184">
+    <w:abstractNumId w:val="16"/>
   </w:num>
-  <w:num w:numId="11" w16cid:durableId="1353724759">
-    <w:abstractNumId w:val="11"/>
-  </w:num>
-  <w:num w:numId="12" w16cid:durableId="1603489458">
-    <w:abstractNumId w:val="13"/>
-  </w:num>
-  <w:num w:numId="13" w16cid:durableId="569385878">
-    <w:abstractNumId w:val="14"/>
-  </w:num>
-  <w:num w:numId="14" w16cid:durableId="2125492633">
-    <w:abstractNumId w:val="3"/>
-  </w:num>
-  <w:num w:numId="15" w16cid:durableId="2102753963">
-    <w:abstractNumId w:val="10"/>
-  </w:num>
-  <w:num w:numId="16" w16cid:durableId="1615818457">
-    <w:abstractNumId w:val="12"/>
+  <w:num w:numId="24" w16cid:durableId="1513757500">
+    <w:abstractNumId w:val="22"/>
   </w:num>
 </w:numbering>
 </file>

</xml_diff>